<commit_message>
docs: update README with Word doc download link and live app URL
- Add FINAL_GROUP_ASSIGNMENT_REPORT.docx download link to README
- Add live app URL https://joshgd1.github.io/wanderless-tourism/#/login
- Regenerated Word doc with broader scope (Luang Prabang as beachhead)
- Live app URL on cover page, Section 1.3, and Section 6.3

Co-Authored-By: Claude Opus 4.7 <noreply@anthropic.com>
</commit_message>
<xml_diff>
--- a/FINAL_GROUP_ASSIGNMENT_REPORT.docx
+++ b/FINAL_GROUP_ASSIGNMENT_REPORT.docx
@@ -2,7 +2,6 @@
 <file path=word/document.xml><?xml version="1.0" encoding="utf-8"?>
 <w:document xmlns:wpc="http://schemas.microsoft.com/office/word/2010/wordprocessingCanvas" xmlns:mo="http://schemas.microsoft.com/office/mac/office/2008/main" xmlns:mc="http://schemas.openxmlformats.org/markup-compatibility/2006" xmlns:mv="urn:schemas-microsoft-com:mac:vml" xmlns:o="urn:schemas-microsoft-com:office:office" xmlns:r="http://schemas.openxmlformats.org/officeDocument/2006/relationships" xmlns:m="http://schemas.openxmlformats.org/officeDocument/2006/math" xmlns:v="urn:schemas-microsoft-com:vml" xmlns:wp14="http://schemas.microsoft.com/office/word/2010/wordprocessingDrawing" xmlns:wp="http://schemas.openxmlformats.org/drawingml/2006/wordprocessingDrawing" xmlns:w10="urn:schemas-microsoft-com:office:word" xmlns:w="http://schemas.openxmlformats.org/wordprocessingml/2006/main" xmlns:w14="http://schemas.microsoft.com/office/word/2010/wordml" xmlns:wpg="http://schemas.microsoft.com/office/word/2010/wordprocessingGroup" xmlns:wpi="http://schemas.microsoft.com/office/word/2010/wordprocessingInk" xmlns:wne="http://schemas.microsoft.com/office/word/2006/wordml" xmlns:wps="http://schemas.microsoft.com/office/word/2010/wordprocessingShape" mc:Ignorable="w14 wp14">
   <w:body>
-    <w:p/>
     <w:p/>
     <w:p/>
     <w:p/>
@@ -42,6 +41,7 @@
           <w:sz w:val="26"/>
         </w:rPr>
         <w:t>MGMT 655: Machine Learning for Decision Making</w:t>
+        <w:br/>
       </w:r>
     </w:p>
     <w:p>
@@ -55,7 +55,6 @@
         <w:t>Professor Jack Hong | Singapore Management University MBA Programme</w:t>
       </w:r>
     </w:p>
-    <w:p/>
     <w:p/>
     <w:p>
       <w:pPr>
@@ -102,13 +101,13 @@
           <w:b/>
           <w:sz w:val="21"/>
         </w:rPr>
-        <w:t xml:space="preserve">Submission: </w:t>
+        <w:t xml:space="preserve">Live App (demo): </w:t>
       </w:r>
       <w:r>
         <w:rPr>
           <w:sz w:val="21"/>
         </w:rPr>
-        <w:t>May 2026</w:t>
+        <w:t>https://joshgd1.github.io/wanderless-tourism/#/login</w:t>
       </w:r>
     </w:p>
     <w:p>
@@ -120,15 +119,13 @@
           <w:b/>
           <w:sz w:val="21"/>
         </w:rPr>
-        <w:t xml:space="preserve">Professor Access: </w:t>
+        <w:t xml:space="preserve">Submission: </w:t>
       </w:r>
       <w:r>
         <w:rPr>
           <w:sz w:val="21"/>
         </w:rPr>
-        <w:t>Professor Hong has been granted repository access.</w:t>
-        <w:br/>
-        <w:t>Access will be removed after grading.</w:t>
+        <w:t>May 2026</w:t>
       </w:r>
     </w:p>
     <w:p/>
@@ -141,7 +138,9 @@
           <w:i/>
           <w:sz w:val="20"/>
         </w:rPr>
-        <w:t>Target Audiences: Business Manager (launch approval) | App User | Fellow Developer (handover)</w:t>
+        <w:t>Target: Business Manager (launch approval) | App User | Fellow Developer (handover)</w:t>
+        <w:br/>
+        <w:t>Professor Hong has been granted repository access. Access will be removed after grading.</w:t>
       </w:r>
     </w:p>
     <w:p>
@@ -157,9 +156,9 @@
         <w:rPr>
           <w:b/>
           <w:color w:val="1F497D"/>
-          <w:sz w:val="32"/>
+          <w:sz w:val="30"/>
         </w:rPr>
-        <w:t>1. Executive Launch Brief</w:t>
+        <w:t>1.  Executive Launch Brief</w:t>
       </w:r>
     </w:p>
     <w:p>
@@ -170,20 +169,20 @@
         <w:rPr>
           <w:sz w:val="21"/>
         </w:rPr>
-        <w:t>WanderLess is a pilot-ready AI/ML decision-support system for compatibility-based local guide matching in Luang Prabang, Laos. Rather than acting as another itinerary generator, it answers the question every traveller faces: which local guide is most compatible with who I am, not just where I am going? The system learns tourist preferences across five dimensions, scores every registered guide against those preferences using a hybrid ML recommender, forms compatible travel groups automatically, and optimises day-by-day itineraries — all with explainable outputs so every recommendation can be understood and trusted.</w:t>
+        <w:t>WanderLess is a pilot-ready AI/ML decision-support platform for compatibility-based local guide matching. Rather than acting as a generic itinerary generator, it answers the question every traveller faces: which local guide is most compatible with who I am — not just where I am going? The system learns tourist preferences across five dimensions, scores every registered guide against those preferences using a hybrid ML recommender, forms compatible travel groups automatically, and optimises day-by-day itineraries — all with explainable outputs so every recommendation can be understood and trusted. The initial beachhead is Luang Prabang, Laos, with expansion planned to Vientiane, Hoi An, and additional SE Asian destinations.</w:t>
       </w:r>
     </w:p>
     <w:p>
       <w:pPr>
-        <w:spacing w:before="200" w:after="60"/>
+        <w:spacing w:before="160" w:after="60"/>
       </w:pPr>
       <w:r>
         <w:rPr>
           <w:b/>
           <w:color w:val="2E74B5"/>
-          <w:sz w:val="24"/>
+          <w:sz w:val="23"/>
         </w:rPr>
-        <w:t>1.1  Three-Audience Value Proposition</w:t>
+        <w:t>1.1  Intended Audiences and Value</w:t>
       </w:r>
     </w:p>
     <w:tbl>
@@ -285,7 +284,7 @@
               <w:rPr>
                 <w:sz w:val="19"/>
               </w:rPr>
-              <w:t xml:space="preserve"> readiness assessment, pilot risk table, 90-day roadmap, go/no-go criteria</w:t>
+              <w:t>Readiness assessment, go/no-go table, 90-day pilot roadmap, revenue model, risk register</w:t>
             </w:r>
           </w:p>
         </w:tc>
@@ -301,7 +300,7 @@
               <w:rPr>
                 <w:sz w:val="19"/>
               </w:rPr>
-              <w:t>This page + Section 5</w:t>
+              <w:t>Sections 1, 5, 7</w:t>
             </w:r>
           </w:p>
         </w:tc>
@@ -335,7 +334,7 @@
               <w:rPr>
                 <w:sz w:val="19"/>
               </w:rPr>
-              <w:t>personalised guide ranked by compatibility; factor-level explainability; safety/trust signal; itinerary</w:t>
+              <w:t>Personalised guide ranking with factor-level explainability; safety/trust signal; itinerary optimisation</w:t>
             </w:r>
           </w:p>
         </w:tc>
@@ -370,6 +369,8 @@
                 <w:sz w:val="19"/>
               </w:rPr>
               <w:t>Fellow Developer</w:t>
+              <w:br/>
+              <w:t>(taking over)</w:t>
             </w:r>
           </w:p>
         </w:tc>
@@ -385,7 +386,7 @@
               <w:rPr>
                 <w:sz w:val="19"/>
               </w:rPr>
-              <w:t>architecture diagrams, API contract, repository structure, setup commands, test accounts, key file inventory</w:t>
+              <w:t>Architecture diagrams, API contract, repository structure, setup commands, test accounts, key file inventory</w:t>
             </w:r>
           </w:p>
         </w:tc>
@@ -407,18 +408,55 @@
         </w:tc>
       </w:tr>
     </w:tbl>
-    <w:p/>
     <w:p>
       <w:pPr>
-        <w:spacing w:before="200" w:after="60"/>
+        <w:spacing w:before="160" w:after="60"/>
       </w:pPr>
       <w:r>
         <w:rPr>
           <w:b/>
           <w:color w:val="2E74B5"/>
+          <w:sz w:val="23"/>
+        </w:rPr>
+        <w:t>1.2  Live Demo</w:t>
+      </w:r>
+    </w:p>
+    <w:p>
+      <w:pPr>
+        <w:spacing w:before="120" w:after="120"/>
+        <w:jc w:val="center"/>
+      </w:pPr>
+      <w:r>
+        <w:rPr>
+          <w:b/>
+          <w:color w:val="1F497D"/>
           <w:sz w:val="24"/>
         </w:rPr>
-        <w:t>1.2  Product at a Glance</w:t>
+        <w:t>Try the live app: https://joshgd1.github.io/wanderless-tourism/#/login</w:t>
+      </w:r>
+    </w:p>
+    <w:p>
+      <w:pPr>
+        <w:spacing w:after="100"/>
+      </w:pPr>
+      <w:r>
+        <w:rPr>
+          <w:sz w:val="21"/>
+        </w:rPr>
+        <w:t>The Flutter web app is deployed and accessible. Use the test accounts below to log in and experience the full guide matching flow.</w:t>
+      </w:r>
+    </w:p>
+    <w:p>
+      <w:pPr>
+        <w:spacing w:before="160" w:after="60"/>
+      </w:pPr>
+      <w:r>
+        <w:rPr>
+          <w:b/>
+          <w:color w:val="2E74B5"/>
+          <w:sz w:val="23"/>
+        </w:rPr>
+        <w:t>1.3  Product at a Glance</w:t>
       </w:r>
     </w:p>
     <w:tbl>
@@ -499,7 +537,7 @@
               <w:rPr>
                 <w:sz w:val="19"/>
               </w:rPr>
-              <w:t>Tourist–Guide compatibility matching + itinerary planning (Luang Prabang)</w:t>
+              <w:t>AI/ML decision-support for tourist–guide compatibility matching, group formation, itinerary planning</w:t>
             </w:r>
           </w:p>
         </w:tc>
@@ -517,7 +555,7 @@
               <w:rPr>
                 <w:sz w:val="19"/>
               </w:rPr>
-              <w:t>ML engine</w:t>
+              <w:t>Beachhead market</w:t>
             </w:r>
           </w:p>
         </w:tc>
@@ -533,7 +571,7 @@
               <w:rPr>
                 <w:sz w:val="19"/>
               </w:rPr>
-              <w:t>Hybrid recommender: 45% cosine similarity + 45% TruncatedSVD collaborative filtering + 10% destination boost</w:t>
+              <w:t>Luang Prabang, Laos (UNESCO World Heritage; MICT-licensed guide ecosystem)</w:t>
             </w:r>
           </w:p>
         </w:tc>
@@ -551,7 +589,7 @@
               <w:rPr>
                 <w:sz w:val="19"/>
               </w:rPr>
-              <w:t>Group formation</w:t>
+              <w:t>Expansion markets</w:t>
             </w:r>
           </w:p>
         </w:tc>
@@ -567,7 +605,7 @@
               <w:rPr>
                 <w:sz w:val="19"/>
               </w:rPr>
-              <w:t>K-Means clustering + DBSCAN outlier detection</w:t>
+              <w:t>Vientiane, Hoi An, 5–8 additional SE Asian cities (post-pilot)</w:t>
             </w:r>
           </w:p>
         </w:tc>
@@ -585,7 +623,7 @@
               <w:rPr>
                 <w:sz w:val="19"/>
               </w:rPr>
-              <w:t>Itinerary optimiser</w:t>
+              <w:t>ML engine</w:t>
             </w:r>
           </w:p>
         </w:tc>
@@ -601,7 +639,7 @@
               <w:rPr>
                 <w:sz w:val="19"/>
               </w:rPr>
-              <w:t>Greedy construction + 2-opt local search</w:t>
+              <w:t>Hybrid recommender: 45% cosine similarity + 45% TruncatedSVD collaborative filtering + 10% destination boost</w:t>
             </w:r>
           </w:p>
         </w:tc>
@@ -619,7 +657,7 @@
               <w:rPr>
                 <w:sz w:val="19"/>
               </w:rPr>
-              <w:t>Safety / trust</w:t>
+              <w:t>Group formation</w:t>
             </w:r>
           </w:p>
         </w:tc>
@@ -635,7 +673,7 @@
               <w:rPr>
                 <w:sz w:val="19"/>
               </w:rPr>
-              <w:t>Rule-based weighted score (prototype, not a guarantee)</w:t>
+              <w:t>K-Means clustering + DBSCAN outlier detection</w:t>
             </w:r>
           </w:p>
         </w:tc>
@@ -653,7 +691,7 @@
               <w:rPr>
                 <w:sz w:val="19"/>
               </w:rPr>
-              <w:t>Backend</w:t>
+              <w:t>Itinerary optimiser</w:t>
             </w:r>
           </w:p>
         </w:tc>
@@ -669,7 +707,7 @@
               <w:rPr>
                 <w:sz w:val="19"/>
               </w:rPr>
-              <w:t>FastAPI + SQLite + JWT — 14 endpoints</w:t>
+              <w:t>Greedy construction + 2-opt local search</w:t>
             </w:r>
           </w:p>
         </w:tc>
@@ -687,7 +725,7 @@
               <w:rPr>
                 <w:sz w:val="19"/>
               </w:rPr>
-              <w:t>Frontend</w:t>
+              <w:t>Safety / trust</w:t>
             </w:r>
           </w:p>
         </w:tc>
@@ -703,7 +741,7 @@
               <w:rPr>
                 <w:sz w:val="19"/>
               </w:rPr>
-              <w:t>Flutter cross-platform mobile app (iOS + Android)</w:t>
+              <w:t>Rule-based weighted score (prototype — decision-support only, not a guarantee)</w:t>
             </w:r>
           </w:p>
         </w:tc>
@@ -721,7 +759,7 @@
               <w:rPr>
                 <w:sz w:val="19"/>
               </w:rPr>
-              <w:t>Data</w:t>
+              <w:t>Backend</w:t>
             </w:r>
           </w:p>
         </w:tc>
@@ -737,7 +775,7 @@
               <w:rPr>
                 <w:sz w:val="19"/>
               </w:rPr>
-              <w:t>400 synthetic tourists, 60 guides, 600 synthetic ratings (labelled)</w:t>
+              <w:t>FastAPI + SQLite + JWT — 14 endpoints</w:t>
             </w:r>
           </w:p>
         </w:tc>
@@ -755,7 +793,7 @@
               <w:rPr>
                 <w:sz w:val="19"/>
               </w:rPr>
-              <w:t>Tests</w:t>
+              <w:t>Frontend</w:t>
             </w:r>
           </w:p>
         </w:tc>
@@ -771,7 +809,7 @@
               <w:rPr>
                 <w:sz w:val="19"/>
               </w:rPr>
-              <w:t>14/14 pytest tests passing</w:t>
+              <w:t>Flutter cross-platform mobile app (iOS + Android + web)</w:t>
             </w:r>
           </w:p>
         </w:tc>
@@ -789,7 +827,7 @@
               <w:rPr>
                 <w:sz w:val="19"/>
               </w:rPr>
-              <w:t>Payments</w:t>
+              <w:t>Data</w:t>
             </w:r>
           </w:p>
         </w:tc>
@@ -805,7 +843,7 @@
               <w:rPr>
                 <w:sz w:val="19"/>
               </w:rPr>
-              <w:t>Fully simulated — no real money moves</w:t>
+              <w:t>400 synthetic tourists, 60 guides, 600 synthetic ratings (labelled)</w:t>
             </w:r>
           </w:p>
         </w:tc>
@@ -823,6 +861,74 @@
               <w:rPr>
                 <w:sz w:val="19"/>
               </w:rPr>
+              <w:t>Tests</w:t>
+            </w:r>
+          </w:p>
+        </w:tc>
+        <w:tc>
+          <w:tcPr>
+            <w:tcW w:type="dxa" w:w="4320"/>
+          </w:tcPr>
+          <w:p>
+            <w:pPr>
+              <w:spacing w:after="40"/>
+            </w:pPr>
+            <w:r>
+              <w:rPr>
+                <w:sz w:val="19"/>
+              </w:rPr>
+              <w:t>14/14 pytest tests passing</w:t>
+            </w:r>
+          </w:p>
+        </w:tc>
+      </w:tr>
+      <w:tr>
+        <w:tc>
+          <w:tcPr>
+            <w:tcW w:type="dxa" w:w="4320"/>
+          </w:tcPr>
+          <w:p>
+            <w:pPr>
+              <w:spacing w:after="40"/>
+            </w:pPr>
+            <w:r>
+              <w:rPr>
+                <w:sz w:val="19"/>
+              </w:rPr>
+              <w:t>Payments</w:t>
+            </w:r>
+          </w:p>
+        </w:tc>
+        <w:tc>
+          <w:tcPr>
+            <w:tcW w:type="dxa" w:w="4320"/>
+          </w:tcPr>
+          <w:p>
+            <w:pPr>
+              <w:spacing w:after="40"/>
+            </w:pPr>
+            <w:r>
+              <w:rPr>
+                <w:sz w:val="19"/>
+              </w:rPr>
+              <w:t>Fully simulated — no real money moves</w:t>
+            </w:r>
+          </w:p>
+        </w:tc>
+      </w:tr>
+      <w:tr>
+        <w:tc>
+          <w:tcPr>
+            <w:tcW w:type="dxa" w:w="4320"/>
+          </w:tcPr>
+          <w:p>
+            <w:pPr>
+              <w:spacing w:after="40"/>
+            </w:pPr>
+            <w:r>
+              <w:rPr>
+                <w:sz w:val="19"/>
+              </w:rPr>
               <w:t>Deploy</w:t>
             </w:r>
           </w:p>
@@ -839,7 +945,7 @@
               <w:rPr>
                 <w:sz w:val="19"/>
               </w:rPr>
-              <w:t>Render free-tier backend (auto-deploys on push)</w:t>
+              <w:t>Render free-tier backend (auto-deploys on push to main)</w:t>
             </w:r>
           </w:p>
         </w:tc>
@@ -847,15 +953,15 @@
     </w:tbl>
     <w:p>
       <w:pPr>
-        <w:spacing w:before="200" w:after="60"/>
+        <w:spacing w:before="160" w:after="60"/>
       </w:pPr>
       <w:r>
         <w:rPr>
           <w:b/>
           <w:color w:val="2E74B5"/>
-          <w:sz w:val="24"/>
+          <w:sz w:val="23"/>
         </w:rPr>
-        <w:t>1.3  Go / No-Go Assessment</w:t>
+        <w:t>1.4  Go / No-Go Assessment</w:t>
       </w:r>
     </w:p>
     <w:tbl>
@@ -1005,7 +1111,7 @@
               <w:rPr>
                 <w:sz w:val="19"/>
               </w:rPr>
-              <w:t>YES — 90 days, 3–5 boutique partners</w:t>
+              <w:t>YES — 90-day, Luang Prabang, 3–5 operator partners</w:t>
             </w:r>
           </w:p>
         </w:tc>
@@ -1021,7 +1127,7 @@
               <w:rPr>
                 <w:sz w:val="19"/>
               </w:rPr>
-              <w:t>This report Section 5</w:t>
+              <w:t>Section 5</w:t>
             </w:r>
           </w:p>
         </w:tc>
@@ -1089,7 +1195,7 @@
               <w:rPr>
                 <w:sz w:val="19"/>
               </w:rPr>
-              <w:t>Safety score guarantee?</w:t>
+              <w:t>Safety score is a guarantee?</w:t>
             </w:r>
           </w:p>
         </w:tc>
@@ -1155,7 +1261,7 @@
               <w:rPr>
                 <w:sz w:val="19"/>
               </w:rPr>
-              <w:t>Technically credible: cosine + SVD + 2-opt are standard methods</w:t>
+              <w:t>Credible: cosine + SVD + 2-opt are standard methods</w:t>
             </w:r>
           </w:p>
         </w:tc>
@@ -1205,7 +1311,7 @@
               <w:rPr>
                 <w:sz w:val="19"/>
               </w:rPr>
-              <w:t>YES — Flutter app + curl fallback via DEMO_API_COMMANDS.md</w:t>
+              <w:t>YES — Flutter app live + curl fallback via DEMO_API_COMMANDS.md</w:t>
             </w:r>
           </w:p>
         </w:tc>
@@ -1240,20 +1346,20 @@
         <w:rPr>
           <w:b/>
           <w:color w:val="1F497D"/>
-          <w:sz w:val="32"/>
+          <w:sz w:val="30"/>
         </w:rPr>
         <w:t>2.  Market and Problem</w:t>
       </w:r>
     </w:p>
     <w:p>
       <w:pPr>
-        <w:spacing w:before="200" w:after="60"/>
+        <w:spacing w:before="160" w:after="60"/>
       </w:pPr>
       <w:r>
         <w:rPr>
           <w:b/>
           <w:color w:val="2E74B5"/>
-          <w:sz w:val="24"/>
+          <w:sz w:val="23"/>
         </w:rPr>
         <w:t>2.1  The Decision Problem</w:t>
       </w:r>
@@ -1266,7 +1372,7 @@
         <w:rPr>
           <w:sz w:val="21"/>
         </w:rPr>
-        <w:t>Luang Prabang receives over 1 million visitors per year. Dozens of licensed local guides offer overlapping services across temple ceremonies, Mekong boat trips, Kuang Si waterfalls, cooking classes, and night markets. The typical solo or small-group traveller spends 3–5 hours researching online and still faces three persistent failures:</w:t>
+        <w:t>Travellers to destinations with rich local guide ecosystems face a persistent threefold failure:</w:t>
       </w:r>
     </w:p>
     <w:p>
@@ -1279,7 +1385,7 @@
         <w:rPr>
           <w:sz w:val="21"/>
         </w:rPr>
-        <w:t>Information asymmetry — aggregate star ratings hide individual mismatch. A 4.9-star guide who specialises in history is a poor match for a traveller who wants food and adventure.</w:t>
+        <w:t>Information asymmetry — aggregate star ratings hide individual mismatch. A 4.9-star guide who specialises in history is a poor match for a traveller who wants food and adventure experiences.</w:t>
       </w:r>
     </w:p>
     <w:p>
@@ -1292,7 +1398,7 @@
         <w:rPr>
           <w:sz w:val="21"/>
         </w:rPr>
-        <w:t>Itinerary complexity — balancing opening hours, travel times, meal breaks, energy levels, and cultural interests across 5–8 stops per day is a combinatorial optimisation problem that travellers solve sub-optimally by hand.</w:t>
+        <w:t>Itinerary complexity — planning a multi-stop trip across opening hours, travel times, meal breaks, and cultural interests is a combinatorial optimisation problem travellers solve sub-optimally by hand.</w:t>
       </w:r>
     </w:p>
     <w:p>
@@ -1305,20 +1411,7 @@
         <w:rPr>
           <w:sz w:val="21"/>
         </w:rPr>
-        <w:t>Group formation friction — solo travellers who want to share a guide's cost have no structured mechanism to find compatible peers.</w:t>
-      </w:r>
-    </w:p>
-    <w:p>
-      <w:pPr>
-        <w:spacing w:before="200" w:after="60"/>
-      </w:pPr>
-      <w:r>
-        <w:rPr>
-          <w:b/>
-          <w:color w:val="2E74B5"/>
-          <w:sz w:val="24"/>
-        </w:rPr>
-        <w:t>2.2  Why Luang Prabang First</w:t>
+        <w:t>Group formation friction — solo travellers who want to share a guide's cost have no structured mechanism to find compatible peers with similar preferences.</w:t>
       </w:r>
     </w:p>
     <w:p>
@@ -1329,18 +1422,42 @@
         <w:rPr>
           <w:sz w:val="21"/>
         </w:rPr>
-        <w:t>Luang Prabang is a UNESCO World Heritage town with a concentrated, high-value guide ecosystem where compatibility matching delivers the clearest user benefit. The defined geographic scope, predictable tourist profile (slow travel, cultural immersion), and structured guide licensing framework (MICT) make it an ideal beachhead for a data-constrained prototype.</w:t>
+        <w:t>Generic travel platforms (Klook, Viator, GetYourGuide) sort by popularity. This means the most-booked guide is surfaced regardless of whether that guide is actually right for the individual traveller. Compatibility matching has been proven in music (Spotify), video (Netflix), and e-commerce (Amazon) — WanderLess brings the same approach to local guided travel.</w:t>
       </w:r>
     </w:p>
     <w:p>
       <w:pPr>
-        <w:spacing w:before="200" w:after="60"/>
+        <w:spacing w:before="160" w:after="60"/>
       </w:pPr>
       <w:r>
         <w:rPr>
           <w:b/>
           <w:color w:val="2E74B5"/>
-          <w:sz w:val="24"/>
+          <w:sz w:val="23"/>
+        </w:rPr>
+        <w:t>2.2  Why Local Guide Matching</w:t>
+      </w:r>
+    </w:p>
+    <w:p>
+      <w:pPr>
+        <w:spacing w:after="100"/>
+      </w:pPr>
+      <w:r>
+        <w:rPr>
+          <w:sz w:val="21"/>
+        </w:rPr>
+        <w:t>Local guided travel is uniquely suited to compatibility matching because: (1) the guide–tourist relationship is high-stakes and repeat-inducing; (2) guide profiles are rich and structured (languages, specialties, pace, personality) — ideal for preference-vector scoring; (3) the geographic concentration of guides in each destination makes data collection feasible.</w:t>
+      </w:r>
+    </w:p>
+    <w:p>
+      <w:pPr>
+        <w:spacing w:before="160" w:after="60"/>
+      </w:pPr>
+      <w:r>
+        <w:rPr>
+          <w:b/>
+          <w:color w:val="2E74B5"/>
+          <w:sz w:val="23"/>
         </w:rPr>
         <w:t>2.3  Competitive Landscape</w:t>
       </w:r>
@@ -1458,7 +1575,7 @@
               <w:rPr>
                 <w:sz w:val="19"/>
               </w:rPr>
-              <w:t>NO</w:t>
+              <w:t>NO — popularity-biased</w:t>
             </w:r>
           </w:p>
         </w:tc>
@@ -1508,7 +1625,7 @@
               <w:rPr>
                 <w:sz w:val="19"/>
               </w:rPr>
-              <w:t>NO — popularity-biased</w:t>
+              <w:t>NO — aggregate scores hide individual mismatch</w:t>
             </w:r>
           </w:p>
         </w:tc>
@@ -1542,7 +1659,7 @@
               <w:rPr>
                 <w:sz w:val="19"/>
               </w:rPr>
-              <w:t>Curated local hosts</w:t>
+              <w:t>Curated local hosts with personality profiles</w:t>
             </w:r>
           </w:p>
         </w:tc>
@@ -1558,7 +1675,7 @@
               <w:rPr>
                 <w:sz w:val="19"/>
               </w:rPr>
-              <w:t>Partially — host personality not captured</w:t>
+              <w:t>Partially — personality not captured systematically</w:t>
             </w:r>
           </w:p>
         </w:tc>
@@ -1592,7 +1709,7 @@
               <w:rPr>
                 <w:sz w:val="19"/>
               </w:rPr>
-              <w:t>ML preference-profile → ranked guide list with explainability</w:t>
+              <w:t>ML preference profile → ranked guide list with explainability</w:t>
             </w:r>
           </w:p>
         </w:tc>
@@ -1608,7 +1725,7 @@
               <w:rPr>
                 <w:sz w:val="19"/>
               </w:rPr>
-              <w:t>YES — core to the product</w:t>
+              <w:t>YES — core product differentiator</w:t>
             </w:r>
           </w:p>
         </w:tc>
@@ -1616,13 +1733,13 @@
     </w:tbl>
     <w:p>
       <w:pPr>
-        <w:spacing w:before="200" w:after="60"/>
+        <w:spacing w:before="160" w:after="60"/>
       </w:pPr>
       <w:r>
         <w:rPr>
           <w:b/>
           <w:color w:val="2E74B5"/>
-          <w:sz w:val="24"/>
+          <w:sz w:val="23"/>
         </w:rPr>
         <w:t>2.4  Market Sizing</w:t>
       </w:r>
@@ -1740,7 +1857,7 @@
               <w:rPr>
                 <w:sz w:val="19"/>
               </w:rPr>
-              <w:t>Global tours, activities, experiences market</w:t>
+              <w:t>Global tours, activities, and experiences market</w:t>
             </w:r>
           </w:p>
         </w:tc>
@@ -1840,12 +1957,36 @@
               <w:rPr>
                 <w:sz w:val="19"/>
               </w:rPr>
-              <w:t>0.5–1% capture in Luang Prabang + 2–3 expansion cities in 3–5 years</w:t>
+              <w:t>0.5–1% capture across Luang Prabang + 2–3 expansion cities in 3–5 years</w:t>
             </w:r>
           </w:p>
         </w:tc>
       </w:tr>
     </w:tbl>
+    <w:p>
+      <w:pPr>
+        <w:spacing w:before="160" w:after="60"/>
+      </w:pPr>
+      <w:r>
+        <w:rPr>
+          <w:b/>
+          <w:color w:val="2E74B5"/>
+          <w:sz w:val="23"/>
+        </w:rPr>
+        <w:t>2.5  Beachhead Strategy</w:t>
+      </w:r>
+    </w:p>
+    <w:p>
+      <w:pPr>
+        <w:spacing w:after="100"/>
+      </w:pPr>
+      <w:r>
+        <w:rPr>
+          <w:sz w:val="21"/>
+        </w:rPr>
+        <w:t>Luang Prabang is the initial beachhead: a UNESCO World Heritage town with a concentrated, MICT-licensed guide ecosystem. The defined geographic scope makes data collection feasible for a prototype. Expansion follows to Vientiane, Hoi An, and additional SE Asian destinations.</w:t>
+      </w:r>
+    </w:p>
     <w:p>
       <w:r>
         <w:br w:type="page"/>
@@ -1859,20 +2000,20 @@
         <w:rPr>
           <w:b/>
           <w:color w:val="1F497D"/>
-          <w:sz w:val="32"/>
+          <w:sz w:val="30"/>
         </w:rPr>
         <w:t>3.  Product Experience for Users</w:t>
       </w:r>
     </w:p>
     <w:p>
       <w:pPr>
-        <w:spacing w:before="200" w:after="60"/>
+        <w:spacing w:before="160" w:after="60"/>
       </w:pPr>
       <w:r>
         <w:rPr>
           <w:b/>
           <w:color w:val="2E74B5"/>
-          <w:sz w:val="24"/>
+          <w:sz w:val="23"/>
         </w:rPr>
         <w:t>3.1  User Journey — Emma the Solo Traveller</w:t>
       </w:r>
@@ -1885,7 +2026,7 @@
         <w:rPr>
           <w:sz w:val="21"/>
         </w:rPr>
-        <w:t>Emma, 30, a UX designer from London, is planning a 4-day solo visit to Luang Prabang. She wants authentic cultural and food-focused experiences but is overwhelmed by choice and unsure which guide will actually suit her. This is the journey WanderLess supports.</w:t>
+        <w:t>Emma, 30, a UX designer from London, is planning a multi-day trip. She wants authentic cultural and food-focused experiences but is overwhelmed by choice and unsure which local guide will suit her preferences. This is the journey WanderLess supports.</w:t>
       </w:r>
     </w:p>
     <w:tbl>
@@ -2006,9 +2147,9 @@
               </w:rPr>
               <w:t>Enters 5-dimension preferences:</w:t>
               <w:br/>
-              <w:t>food / culture / adventure / pace</w:t>
+              <w:t>food / culture / adventure / pace / budget</w:t>
               <w:br/>
-              <w:t>budget / language / dietary / safety</w:t>
+              <w:t>language / dietary / safety comfort</w:t>
             </w:r>
           </w:p>
         </w:tc>
@@ -2026,7 +2167,7 @@
               </w:rPr>
               <w:t>Stored tourist profile;</w:t>
               <w:br/>
-              <w:t>compatibility model ready</w:t>
+              <w:t>compatibility engine ready</w:t>
             </w:r>
           </w:p>
         </w:tc>
@@ -2076,7 +2217,7 @@
               <w:rPr>
                 <w:sz w:val="19"/>
               </w:rPr>
-              <w:t>Browses Luang Prabang guides;</w:t>
+              <w:t>Browses available guides;</w:t>
               <w:br/>
               <w:t>sees ranked compatibility list</w:t>
             </w:r>
@@ -2100,7 +2241,7 @@
               <w:br/>
               <w:t>• Content / Collab / Boost split</w:t>
               <w:br/>
-              <w:t>• Safety / trust indicator</w:t>
+              <w:t>• Safety/trust indicator</w:t>
             </w:r>
           </w:p>
         </w:tc>
@@ -2314,7 +2455,7 @@
               </w:rPr>
               <w:t>Simulated booking confirmation;</w:t>
               <w:br/>
-              <w:t>S$ wallet debit; guide notified</w:t>
+              <w:t>wallet debit; guide notified</w:t>
             </w:r>
           </w:p>
         </w:tc>
@@ -2330,7 +2471,7 @@
               <w:rPr>
                 <w:sz w:val="19"/>
               </w:rPr>
-              <w:t>Commits to the plan or adjusts preferences</w:t>
+              <w:t>Commits or adjusts preferences</w:t>
             </w:r>
           </w:p>
         </w:tc>
@@ -2338,15 +2479,15 @@
     </w:tbl>
     <w:p>
       <w:pPr>
-        <w:spacing w:before="200" w:after="60"/>
+        <w:spacing w:before="160" w:after="60"/>
       </w:pPr>
       <w:r>
         <w:rPr>
           <w:b/>
           <w:color w:val="2E74B5"/>
-          <w:sz w:val="24"/>
+          <w:sz w:val="23"/>
         </w:rPr>
-        <w:t>3.2  Explainability in Practice</w:t>
+        <w:t>3.2  How the Recommender Works</w:t>
       </w:r>
     </w:p>
     <w:p>
@@ -2357,7 +2498,7 @@
         <w:rPr>
           <w:sz w:val="21"/>
         </w:rPr>
-        <w:t>When Emma requests recommendations, the backend computes three signals for each guide:</w:t>
+        <w:t>When Emma requests recommendations, three signals are computed for each guide:</w:t>
       </w:r>
     </w:p>
     <w:p>
@@ -2370,7 +2511,7 @@
         <w:rPr>
           <w:sz w:val="21"/>
         </w:rPr>
-        <w:t>Content-based score (45%): cosine similarity between Emma's preference vector and the guide's expertise vector across food, culture, adventure, pace, and budget dimensions.</w:t>
+        <w:t>Content-based (45%): cosine similarity between Emma's preference vector and the guide's expertise vector across food, culture, adventure, pace, and budget.</w:t>
       </w:r>
     </w:p>
     <w:p>
@@ -2383,7 +2524,7 @@
         <w:rPr>
           <w:sz w:val="21"/>
         </w:rPr>
-        <w:t>Collaborative score (45%): TruncatedSVD predicts how travellers with similar profiles rated this guide, using 600 synthetic ratings decomposed into 20 latent factors.</w:t>
+        <w:t>Collaborative (45%): TruncatedSVD (k=20) predicts how travellers with similar profiles rated this guide, using 600 synthetic ratings decomposed into 20 latent factors.</w:t>
       </w:r>
     </w:p>
     <w:p>
@@ -2396,7 +2537,7 @@
         <w:rPr>
           <w:sz w:val="21"/>
         </w:rPr>
-        <w:t>Destination boost (10%): a 10% bonus applied to Luang Prabang-verified guides, ensuring local specialists are not drowned out by more-popular distant alternatives.</w:t>
+        <w:t>Destination boost (10%): a 10% bonus for Luang Prabang-verified guides, ensuring local specialists are not drowned out by more-popular distant alternatives.</w:t>
       </w:r>
     </w:p>
     <w:p>
@@ -2407,18 +2548,18 @@
         <w:rPr>
           <w:sz w:val="21"/>
         </w:rPr>
-        <w:t>The Flutter UI decomposes each score into a horizontal bar chart so Emma can see at a glance whether a high score comes from her profile matching the guide's expertise (good for her preferences) or from popularity (less personalised).</w:t>
+        <w:t>The UI decomposes each score into a bar chart so Emma can see whether a high score comes from preference fit (personalised) or popularity (generic).</w:t>
       </w:r>
     </w:p>
     <w:p>
       <w:pPr>
-        <w:spacing w:before="200" w:after="60"/>
+        <w:spacing w:before="160" w:after="60"/>
       </w:pPr>
       <w:r>
         <w:rPr>
           <w:b/>
           <w:color w:val="2E74B5"/>
-          <w:sz w:val="24"/>
+          <w:sz w:val="23"/>
         </w:rPr>
         <w:t>3.3  Safety / Trust Indicator</w:t>
       </w:r>
@@ -2431,7 +2572,7 @@
         <w:rPr>
           <w:sz w:val="21"/>
         </w:rPr>
-        <w:t>Each guide card displays a composite safety/trust score (0–100) built from: MICT license verification status, language alignment with the tourist's stated language, tour density (low-density tours preferred for safety-comfort), and preference fit score. This is a decision-support prototype — it helps Emma form a judgement; it does not certify safety outcomes. All guide cards include a plain-language disclosure to this effect.</w:t>
+        <w:t>Each guide card displays a composite safety/trust score (0–100) from: MICT license verification, language alignment, tour density, and preference fit. This is a decision-support prototype — it helps Emma form a judgement; it does not certify safety outcomes. All guide cards include a plain-language disclosure to this effect.</w:t>
       </w:r>
     </w:p>
     <w:p>
@@ -2447,20 +2588,20 @@
         <w:rPr>
           <w:b/>
           <w:color w:val="1F497D"/>
-          <w:sz w:val="32"/>
+          <w:sz w:val="30"/>
         </w:rPr>
         <w:t>4.  AI/ML Decision-Support Design</w:t>
       </w:r>
     </w:p>
     <w:p>
       <w:pPr>
-        <w:spacing w:before="200" w:after="60"/>
+        <w:spacing w:before="160" w:after="60"/>
       </w:pPr>
       <w:r>
         <w:rPr>
           <w:b/>
           <w:color w:val="2E74B5"/>
-          <w:sz w:val="24"/>
+          <w:sz w:val="23"/>
         </w:rPr>
         <w:t>4.1  Five ML Modules</w:t>
       </w:r>
@@ -2649,9 +2790,7 @@
               <w:rPr>
                 <w:sz w:val="19"/>
               </w:rPr>
-              <w:t>K-Means (silhouette-optimal k)</w:t>
-              <w:br/>
-              <w:t>+ DBSCAN outlier detection</w:t>
+              <w:t>K-Means (silhouette-optimal k) + DBSCAN outlier detection</w:t>
             </w:r>
           </w:p>
         </w:tc>
@@ -2717,9 +2856,7 @@
               <w:rPr>
                 <w:sz w:val="19"/>
               </w:rPr>
-              <w:t>Greedy construction</w:t>
-              <w:br/>
-              <w:t>+ 2-opt local search</w:t>
+              <w:t>Greedy construction + 2-opt local search</w:t>
             </w:r>
           </w:p>
         </w:tc>
@@ -2785,9 +2922,7 @@
               <w:rPr>
                 <w:sz w:val="19"/>
               </w:rPr>
-              <w:t>Rule-based: daily_rate × duration</w:t>
-              <w:br/>
-              <w:t>× season × group_size</w:t>
+              <w:t>Rule-based: daily_rate × duration × season × group_size</w:t>
             </w:r>
           </w:p>
         </w:tc>
@@ -2853,9 +2988,7 @@
               <w:rPr>
                 <w:sz w:val="19"/>
               </w:rPr>
-              <w:t>XGBoost regression</w:t>
-              <w:br/>
-              <w:t>(prototype)</w:t>
+              <w:t>XGBoost regression (prototype)</w:t>
             </w:r>
           </w:p>
         </w:tc>
@@ -2887,7 +3020,7 @@
               <w:rPr>
                 <w:sz w:val="19"/>
               </w:rPr>
-              <w:t>Prototype; needs real ratings before production wiring</w:t>
+              <w:t>Needs real ratings before production wiring</w:t>
             </w:r>
           </w:p>
         </w:tc>
@@ -2895,13 +3028,13 @@
     </w:tbl>
     <w:p>
       <w:pPr>
-        <w:spacing w:before="200" w:after="60"/>
+        <w:spacing w:before="160" w:after="60"/>
       </w:pPr>
       <w:r>
         <w:rPr>
           <w:b/>
           <w:color w:val="2E74B5"/>
-          <w:sz w:val="24"/>
+          <w:sz w:val="23"/>
         </w:rPr>
         <w:t>4.2  Hybrid Recommender — Technical Detail</w:t>
       </w:r>
@@ -2914,29 +3047,7 @@
         <w:rPr>
           <w:sz w:val="21"/>
         </w:rPr>
-        <w:t>The hybrid recommender addresses the cold-start problem: new guides with few ratings still receive meaningful scores because content-based similarity (preference vs expertise) does not depend on historical ratings.</w:t>
-      </w:r>
-    </w:p>
-    <w:p>
-      <w:pPr>
-        <w:spacing w:after="100"/>
-      </w:pPr>
-      <w:r>
-        <w:rPr>
-          <w:sz w:val="21"/>
-        </w:rPr>
-        <w:t>Training data: 600 synthetic tourist–guide–rating tuples (400 tourists × 60 guides), generated using a model that produces 4.2 mean rating, 0.8 std, 0.65 guide-rating correlation, and log-nonlinear interest match. All tuples labelled rating_source: 'synthetic'.</w:t>
-      </w:r>
-    </w:p>
-    <w:p>
-      <w:pPr>
-        <w:spacing w:after="100"/>
-      </w:pPr>
-      <w:r>
-        <w:rPr>
-          <w:sz w:val="21"/>
-        </w:rPr>
-        <w:t>TruncatedSVD (sklearn.decomposition.TruncatedSVD, n_components=20, random_state=42) is fit on the ratings matrix during the seed phase. The resulting latent factors are stored and used to score any tourist–guide pair on demand.</w:t>
+        <w:t>The hybrid approach addresses cold-start: new guides with few ratings still receive meaningful scores because content-based similarity does not depend on historical ratings. Training data: 600 synthetic tourist–guide–rating tuples (88% genuine signal + 12% calibrated noise), labelled rating_source: 'synthetic'. TruncatedSVD (sklearn, n_components=20) is fit on the ratings matrix during the seed phase and stored for on-demand scoring.</w:t>
       </w:r>
     </w:p>
     <w:p>
@@ -2953,39 +3064,24 @@
           <w:color w:val="2D2D2D"/>
           <w:sz w:val="17"/>
         </w:rPr>
-        <w:t># Simplified scoring (backend/ml/recommender.py)</w:t>
+        <w:t>content = cosine_similarity(tourist.pref_vec, guide.exp_vec)   # 0-1</w:t>
         <w:br/>
-        <w:t>content_score = cosine_similarity(</w:t>
+        <w:t>collab  = svd.predict(tourist_id, guide_id) / 5.0             # 0-1</w:t>
         <w:br/>
-        <w:t xml:space="preserve">    tourist.preference_vector,</w:t>
+        <w:t>boost   = 1.1 if guide.destination in DESTINATIONS else 1.0</w:t>
         <w:br/>
-        <w:t xml:space="preserve">    guide.expertise_vector)          # 0–1</w:t>
-        <w:br/>
-        <w:br/>
-        <w:t>collab_score = svd.predict(</w:t>
-        <w:br/>
-        <w:t xml:space="preserve">    tourist_id, guide_id) / 5.0     # normalised to 0–1</w:t>
-        <w:br/>
-        <w:br/>
-        <w:t>dest_boost = 1.1 if guide.destination == "Luang Prabang" else 1.0</w:t>
-        <w:br/>
-        <w:br/>
-        <w:t>final_score = (0.45 * content_score</w:t>
-        <w:br/>
-        <w:t xml:space="preserve">             + 0.45 * collab_score</w:t>
-        <w:br/>
-        <w:t xml:space="preserve">             + 0.10 * dest_boost) * 100  # 0–100</w:t>
+        <w:t>score   = (0.45 * content + 0.45 * collab + 0.10 * boost) * 100</w:t>
       </w:r>
     </w:p>
     <w:p>
       <w:pPr>
-        <w:spacing w:before="200" w:after="60"/>
+        <w:spacing w:before="160" w:after="60"/>
       </w:pPr>
       <w:r>
         <w:rPr>
           <w:b/>
           <w:color w:val="2E74B5"/>
-          <w:sz w:val="24"/>
+          <w:sz w:val="23"/>
         </w:rPr>
         <w:t>4.3  Itinerary Optimiser — Greedy + 2-opt</w:t>
       </w:r>
@@ -2998,29 +3094,18 @@
         <w:rPr>
           <w:sz w:val="21"/>
         </w:rPr>
-        <w:t>The greedy phase constructs an initial route by repeatedly selecting the nearest unvisited point that satisfies time-window constraints. The 2-opt phase then iteratively reverses segments of the route to reduce total travel time, converging in O(n²) time where n is the number of stops. This is a standard metaheuristic for the capacitated vehicle routing problem (CVRP) variant we face.</w:t>
+        <w:t>Greedy phase: build initial route by selecting the nearest unvisited stop satisfying time-window and budget constraints. 2-opt phase: iteratively reverse route segments to reduce total travel time (standard CVRP metaheuristic). Constraints: opening hours, meal breaks (12:00–13:00), daily budget cap, max 8h guiding/day.</w:t>
       </w:r>
     </w:p>
     <w:p>
       <w:pPr>
-        <w:spacing w:after="100"/>
-      </w:pPr>
-      <w:r>
-        <w:rPr>
-          <w:sz w:val="21"/>
-        </w:rPr>
-        <w:t>Constraints respected: opening hours, meal breaks (12:00–13:00), daily budget cap, maximum 8 hours guiding per day, travel time between stops.</w:t>
-      </w:r>
-    </w:p>
-    <w:p>
-      <w:pPr>
-        <w:spacing w:before="200" w:after="60"/>
+        <w:spacing w:before="160" w:after="60"/>
       </w:pPr>
       <w:r>
         <w:rPr>
           <w:b/>
           <w:color w:val="2E74B5"/>
-          <w:sz w:val="24"/>
+          <w:sz w:val="23"/>
         </w:rPr>
         <w:t>4.4  Model Governance</w:t>
       </w:r>
@@ -3035,7 +3120,7 @@
         <w:rPr>
           <w:sz w:val="21"/>
         </w:rPr>
-        <w:t>All training data labelled rating_source: 'synthetic' — no ambiguity in documentation</w:t>
+        <w:t>All training data labelled rating_source: 'synthetic' — no ambiguity</w:t>
       </w:r>
     </w:p>
     <w:p>
@@ -3048,7 +3133,7 @@
         <w:rPr>
           <w:sz w:val="21"/>
         </w:rPr>
-        <w:t>ML weight configuration (45/45/10) is exposed as constants — tunable in production without code changes</w:t>
+        <w:t>ML weight configuration (45/45/10) is a constant — tunable in production without code changes</w:t>
       </w:r>
     </w:p>
     <w:p>
@@ -3074,7 +3159,7 @@
         <w:rPr>
           <w:sz w:val="21"/>
         </w:rPr>
-        <w:t>Fair-exposure monitoring: inverse-frequency regularisation applied to prevent popularity concentration</w:t>
+        <w:t>Inverse-frequency regularisation prevents popularity concentration in collaborative filtering</w:t>
       </w:r>
     </w:p>
     <w:p>
@@ -3090,20 +3175,20 @@
         <w:rPr>
           <w:b/>
           <w:color w:val="1F497D"/>
-          <w:sz w:val="32"/>
+          <w:sz w:val="30"/>
         </w:rPr>
-        <w:t>5.  Business Model and 90-Day Pilot Plan</w:t>
+        <w:t>5.  Business Model and Pilot Plan</w:t>
       </w:r>
     </w:p>
     <w:p>
       <w:pPr>
-        <w:spacing w:before="200" w:after="60"/>
+        <w:spacing w:before="160" w:after="60"/>
       </w:pPr>
       <w:r>
         <w:rPr>
           <w:b/>
           <w:color w:val="2E74B5"/>
-          <w:sz w:val="24"/>
+          <w:sz w:val="23"/>
         </w:rPr>
         <w:t>5.1  Revenue Model</w:t>
       </w:r>
@@ -3116,7 +3201,7 @@
         <w:rPr>
           <w:sz w:val="21"/>
         </w:rPr>
-        <w:t>WanderLess operates as a B2B2C commission marketplace. All payments are currently simulated. The revenue logic is implemented and wired; no real money moves.</w:t>
+        <w:t>WanderLess is a B2B2C commission marketplace. All payments are currently simulated.</w:t>
       </w:r>
     </w:p>
     <w:tbl>
@@ -3413,18 +3498,18 @@
         <w:rPr>
           <w:sz w:val="21"/>
         </w:rPr>
-        <w:t>Commission rate rationale: WanderLess takes 15–18%, below Viator (~25%) and GetYourGuide (~20%). The rate is justified by superior match quality, not just transaction facilitation. Disintermediation tolerance: 20–30% of tourists estimated to attempt direct guide contact post-introduction — accepted as a marketplace tax.</w:t>
+        <w:t>Commission rationale: WanderLess takes 15–18% vs Viator (~25%) and GetYourGuide (~20%). Rate justified by match quality. Disintermediation tolerance: 20–30% estimated to attempt direct contact post-introduction — accepted as a marketplace tax.</w:t>
       </w:r>
     </w:p>
     <w:p>
       <w:pPr>
-        <w:spacing w:before="200" w:after="60"/>
+        <w:spacing w:before="160" w:after="60"/>
       </w:pPr>
       <w:r>
         <w:rPr>
           <w:b/>
           <w:color w:val="2E74B5"/>
-          <w:sz w:val="24"/>
+          <w:sz w:val="23"/>
         </w:rPr>
         <w:t>5.2  Unit Economics</w:t>
       </w:r>
@@ -3651,13 +3736,13 @@
     </w:tbl>
     <w:p>
       <w:pPr>
-        <w:spacing w:before="200" w:after="60"/>
+        <w:spacing w:before="160" w:after="60"/>
       </w:pPr>
       <w:r>
         <w:rPr>
           <w:b/>
           <w:color w:val="2E74B5"/>
-          <w:sz w:val="24"/>
+          <w:sz w:val="23"/>
         </w:rPr>
         <w:t>5.3  90-Day Pilot Roadmap</w:t>
       </w:r>
@@ -3956,15 +4041,15 @@
     </w:tbl>
     <w:p>
       <w:pPr>
-        <w:spacing w:before="200" w:after="60"/>
+        <w:spacing w:before="160" w:after="60"/>
       </w:pPr>
       <w:r>
         <w:rPr>
           <w:b/>
           <w:color w:val="2E74B5"/>
-          <w:sz w:val="24"/>
+          <w:sz w:val="23"/>
         </w:rPr>
-        <w:t>5.4  Launch Go-No-Go Summary</w:t>
+        <w:t>5.4  Geographic Expansion Path</w:t>
       </w:r>
     </w:p>
     <w:tbl>
@@ -3994,7 +4079,7 @@
                 <w:b/>
                 <w:sz w:val="19"/>
               </w:rPr>
-              <w:t>Condition</w:t>
+              <w:t>Phase</w:t>
             </w:r>
           </w:p>
         </w:tc>
@@ -4012,7 +4097,7 @@
                 <w:b/>
                 <w:sz w:val="19"/>
               </w:rPr>
-              <w:t>Decision</w:t>
+              <w:t>Timeline</w:t>
             </w:r>
           </w:p>
         </w:tc>
@@ -4030,7 +4115,7 @@
                 <w:b/>
                 <w:sz w:val="19"/>
               </w:rPr>
-              <w:t>Rationale</w:t>
+              <w:t>Market</w:t>
             </w:r>
           </w:p>
         </w:tc>
@@ -4048,7 +4133,7 @@
               <w:rPr>
                 <w:sz w:val="19"/>
               </w:rPr>
-              <w:t>ML recommender quality?</w:t>
+              <w:t>Beachhead</w:t>
             </w:r>
           </w:p>
         </w:tc>
@@ -4064,7 +4149,7 @@
               <w:rPr>
                 <w:sz w:val="19"/>
               </w:rPr>
-              <w:t>CONDITIONAL GO — pilot validates</w:t>
+              <w:t>Months 1–9</w:t>
             </w:r>
           </w:p>
         </w:tc>
@@ -4080,7 +4165,7 @@
               <w:rPr>
                 <w:sz w:val="19"/>
               </w:rPr>
-              <w:t>Cosine+SVD is credible; synthetic data limits confidence</w:t>
+              <w:t>Luang Prabang, Laos</w:t>
             </w:r>
           </w:p>
         </w:tc>
@@ -4098,7 +4183,7 @@
               <w:rPr>
                 <w:sz w:val="19"/>
               </w:rPr>
-              <w:t>Safety score?</w:t>
+              <w:t>Expansion 1</w:t>
             </w:r>
           </w:p>
         </w:tc>
@@ -4114,7 +4199,7 @@
               <w:rPr>
                 <w:sz w:val="19"/>
               </w:rPr>
-              <w:t>HUMAN-OVERRIDE REQUIRED for all safety disputes</w:t>
+              <w:t>Months 10–18</w:t>
             </w:r>
           </w:p>
         </w:tc>
@@ -4130,7 +4215,7 @@
               <w:rPr>
                 <w:sz w:val="19"/>
               </w:rPr>
-              <w:t>Rule-based prototype; not a safety certification</w:t>
+              <w:t>Vientiane, Laos + Hoi An, Vietnam</w:t>
             </w:r>
           </w:p>
         </w:tc>
@@ -4148,7 +4233,7 @@
               <w:rPr>
                 <w:sz w:val="19"/>
               </w:rPr>
-              <w:t>Payment risk?</w:t>
+              <w:t>Expansion 2</w:t>
             </w:r>
           </w:p>
         </w:tc>
@@ -4164,7 +4249,7 @@
               <w:rPr>
                 <w:sz w:val="19"/>
               </w:rPr>
-              <w:t>NO RISK — all payments simulated</w:t>
+              <w:t>Months 18–36</w:t>
             </w:r>
           </w:p>
         </w:tc>
@@ -4180,57 +4265,7 @@
               <w:rPr>
                 <w:sz w:val="19"/>
               </w:rPr>
-              <w:t>No real money; Stripe integration is future work</w:t>
-            </w:r>
-          </w:p>
-        </w:tc>
-      </w:tr>
-      <w:tr>
-        <w:tc>
-          <w:tcPr>
-            <w:tcW w:type="dxa" w:w="2880"/>
-          </w:tcPr>
-          <w:p>
-            <w:pPr>
-              <w:spacing w:after="40"/>
-            </w:pPr>
-            <w:r>
-              <w:rPr>
-                <w:sz w:val="19"/>
-              </w:rPr>
-              <w:t>Data moat?</w:t>
-            </w:r>
-          </w:p>
-        </w:tc>
-        <w:tc>
-          <w:tcPr>
-            <w:tcW w:type="dxa" w:w="2880"/>
-          </w:tcPr>
-          <w:p>
-            <w:pPr>
-              <w:spacing w:after="40"/>
-            </w:pPr>
-            <w:r>
-              <w:rPr>
-                <w:sz w:val="19"/>
-              </w:rPr>
-              <w:t>SYNTHETIC for now; real data in pilot</w:t>
-            </w:r>
-          </w:p>
-        </w:tc>
-        <w:tc>
-          <w:tcPr>
-            <w:tcW w:type="dxa" w:w="2880"/>
-          </w:tcPr>
-          <w:p>
-            <w:pPr>
-              <w:spacing w:after="40"/>
-            </w:pPr>
-            <w:r>
-              <w:rPr>
-                <w:sz w:val="19"/>
-              </w:rPr>
-              <w:t>600 synthetic ratings bootstrap CF; ~10K real ratings needed for production model</w:t>
+              <w:t>5–8 additional SE Asian cities</w:t>
             </w:r>
           </w:p>
         </w:tc>
@@ -4249,20 +4284,20 @@
         <w:rPr>
           <w:b/>
           <w:color w:val="1F497D"/>
-          <w:sz w:val="32"/>
+          <w:sz w:val="30"/>
         </w:rPr>
         <w:t>6.  Technical Architecture and Developer Handover</w:t>
       </w:r>
     </w:p>
     <w:p>
       <w:pPr>
-        <w:spacing w:before="200" w:after="60"/>
+        <w:spacing w:before="160" w:after="60"/>
       </w:pPr>
       <w:r>
         <w:rPr>
           <w:b/>
           <w:color w:val="2E74B5"/>
-          <w:sz w:val="24"/>
+          <w:sz w:val="23"/>
         </w:rPr>
         <w:t>6.1  Repository Structure</w:t>
       </w:r>
@@ -4348,7 +4383,7 @@
               <w:rPr>
                 <w:sz w:val="19"/>
               </w:rPr>
-              <w:t>Entry point</w:t>
+              <w:t>API entry</w:t>
             </w:r>
           </w:p>
         </w:tc>
@@ -4448,7 +4483,7 @@
               <w:rPr>
                 <w:sz w:val="19"/>
               </w:rPr>
-              <w:t>Matching logic</w:t>
+              <w:t>Matching</w:t>
             </w:r>
           </w:p>
         </w:tc>
@@ -4480,7 +4515,7 @@
               <w:rPr>
                 <w:sz w:val="19"/>
               </w:rPr>
-              <w:t>Compatibility scoring with factor breakdown</w:t>
+              <w:t>Compatibility scoring with factor breakdown returned</w:t>
             </w:r>
           </w:p>
         </w:tc>
@@ -4498,7 +4533,7 @@
               <w:rPr>
                 <w:sz w:val="19"/>
               </w:rPr>
-              <w:t>ML recommender</w:t>
+              <w:t>Recommender</w:t>
             </w:r>
           </w:p>
         </w:tc>
@@ -4530,7 +4565,7 @@
               <w:rPr>
                 <w:sz w:val="19"/>
               </w:rPr>
-              <w:t>HybridRecommender class — cosine + SVD + boost</w:t>
+              <w:t>HybridRecommender — cosine + SVD + boost</w:t>
             </w:r>
           </w:p>
         </w:tc>
@@ -4648,7 +4683,7 @@
               <w:rPr>
                 <w:sz w:val="19"/>
               </w:rPr>
-              <w:t>Safety score</w:t>
+              <w:t>Safety</w:t>
             </w:r>
           </w:p>
         </w:tc>
@@ -4681,56 +4716,6 @@
                 <w:sz w:val="19"/>
               </w:rPr>
               <w:t>RuleBasedSafetyScorer</w:t>
-            </w:r>
-          </w:p>
-        </w:tc>
-      </w:tr>
-      <w:tr>
-        <w:tc>
-          <w:tcPr>
-            <w:tcW w:type="dxa" w:w="2880"/>
-          </w:tcPr>
-          <w:p>
-            <w:pPr>
-              <w:spacing w:after="40"/>
-            </w:pPr>
-            <w:r>
-              <w:rPr>
-                <w:sz w:val="19"/>
-              </w:rPr>
-              <w:t>Pricing</w:t>
-            </w:r>
-          </w:p>
-        </w:tc>
-        <w:tc>
-          <w:tcPr>
-            <w:tcW w:type="dxa" w:w="2880"/>
-          </w:tcPr>
-          <w:p>
-            <w:pPr>
-              <w:spacing w:after="40"/>
-            </w:pPr>
-            <w:r>
-              <w:rPr>
-                <w:sz w:val="19"/>
-              </w:rPr>
-              <w:t>backend/ml/pricing.py</w:t>
-            </w:r>
-          </w:p>
-        </w:tc>
-        <w:tc>
-          <w:tcPr>
-            <w:tcW w:type="dxa" w:w="2880"/>
-          </w:tcPr>
-          <w:p>
-            <w:pPr>
-              <w:spacing w:after="40"/>
-            </w:pPr>
-            <w:r>
-              <w:rPr>
-                <w:sz w:val="19"/>
-              </w:rPr>
-              <w:t>DynamicPricingEngine</w:t>
             </w:r>
           </w:p>
         </w:tc>
@@ -4938,15 +4923,15 @@
     </w:tbl>
     <w:p>
       <w:pPr>
-        <w:spacing w:before="200" w:after="60"/>
+        <w:spacing w:before="160" w:after="60"/>
       </w:pPr>
       <w:r>
         <w:rPr>
           <w:b/>
           <w:color w:val="2E74B5"/>
-          <w:sz w:val="24"/>
+          <w:sz w:val="23"/>
         </w:rPr>
-        <w:t>6.2  API Request Flow</w:t>
+        <w:t>6.2  API Request Flow (simplified)</w:t>
       </w:r>
     </w:p>
     <w:p>
@@ -4965,55 +4950,37 @@
         </w:rPr>
         <w:t>GET /api/recommendations?tourist_id=T001&amp;destination=Luang%20Prabang</w:t>
         <w:br/>
-        <w:t>Authorization: Bearer &lt;jwt_token&gt;</w:t>
+        <w:t>Authorization: Bearer &lt;jwt&gt;</w:t>
         <w:br/>
         <w:br/>
-        <w:t>Response:</w:t>
+        <w:t>Response: { guides: [ {</w:t>
         <w:br/>
-        <w:t>{</w:t>
+        <w:t xml:space="preserve">    guide_id: "GLP001",</w:t>
         <w:br/>
-        <w:t xml:space="preserve">  "guides": [</w:t>
+        <w:t xml:space="preserve">    name: "Bounmy Phommasak",</w:t>
         <w:br/>
-        <w:t xml:space="preserve">    {</w:t>
+        <w:t xml:space="preserve">    composite_score: 87.3,</w:t>
         <w:br/>
-        <w:t xml:space="preserve">      "guide_id": "GLP001",</w:t>
+        <w:t xml:space="preserve">    factors: { content_score: 42.1, collab_score: 39.8, dest_boost: 5.4 },</w:t>
         <w:br/>
-        <w:t xml:space="preserve">      "name": "Bounmy Phommasak",</w:t>
+        <w:t xml:space="preserve">    safety_score: 78,</w:t>
         <w:br/>
-        <w:t xml:space="preserve">      "composite_score": 87.3,</w:t>
+        <w:t xml:space="preserve">    itinerary: { ... }   // optional</w:t>
         <w:br/>
-        <w:t xml:space="preserve">      "factors": {</w:t>
-        <w:br/>
-        <w:t xml:space="preserve">        "content_score": 42.1,   ← cosine similarity contribution</w:t>
-        <w:br/>
-        <w:t xml:space="preserve">        "collab_score": 39.8,   ← SVD collaborative contribution</w:t>
-        <w:br/>
-        <w:t xml:space="preserve">        "dest_boost":  5.4      ← Luang Prabang boost</w:t>
-        <w:br/>
-        <w:t xml:space="preserve">      },</w:t>
-        <w:br/>
-        <w:t xml:space="preserve">      "safety_score": 78,</w:t>
-        <w:br/>
-        <w:t xml:space="preserve">      "itinerary": { ... }       ← optional, returned if requested</w:t>
-        <w:br/>
-        <w:t xml:space="preserve">    }</w:t>
-        <w:br/>
-        <w:t xml:space="preserve">  ]</w:t>
-        <w:br/>
-        <w:t>}</w:t>
+        <w:t>} ] }</w:t>
       </w:r>
     </w:p>
     <w:p>
       <w:pPr>
-        <w:spacing w:before="200" w:after="60"/>
+        <w:spacing w:before="160" w:after="60"/>
       </w:pPr>
       <w:r>
         <w:rPr>
           <w:b/>
           <w:color w:val="2E74B5"/>
-          <w:sz w:val="24"/>
+          <w:sz w:val="23"/>
         </w:rPr>
-        <w:t>6.3  Setup and Running</w:t>
+        <w:t>6.3  Setup Commands</w:t>
       </w:r>
     </w:p>
     <w:p>
@@ -5032,44 +4999,42 @@
         </w:rPr>
         <w:t># Backend</w:t>
         <w:br/>
-        <w:t>cd backend</w:t>
+        <w:t>cd backend &amp;&amp; pip install -r requirements.txt</w:t>
         <w:br/>
-        <w:t>pip install -r requirements.txt</w:t>
+        <w:t>python seed_accounts.py   # seeds test accounts + guides</w:t>
         <w:br/>
-        <w:t>python seed_accounts.py    # seeds test accounts + 60 Luang Prabang guides</w:t>
-        <w:br/>
-        <w:t>python main.py             # starts FastAPI on http://localhost:8000</w:t>
-        <w:br/>
-        <w:br/>
-        <w:t># API docs: http://localhost:8000/docs</w:t>
+        <w:t>python main.py            # http://localhost:8000  |  API docs: /docs</w:t>
         <w:br/>
         <w:br/>
         <w:t># Tests</w:t>
         <w:br/>
-        <w:t>cd backend &amp;&amp; python -m pytest ../tests -x -v</w:t>
-        <w:br/>
-        <w:t># Expected: 14/14 tests passing ✓</w:t>
+        <w:t>cd backend &amp;&amp; python -m pytest ../tests -x -v   # 14/14 passing</w:t>
         <w:br/>
         <w:br/>
-        <w:t># Frontend</w:t>
+        <w:t># Flutter</w:t>
         <w:br/>
         <w:t>cd app &amp;&amp; flutter pub get &amp;&amp; flutter run</w:t>
         <w:br/>
         <w:br/>
-        <w:t># Fallback if Flutter unavailable</w:t>
+        <w:t># Live app (already deployed)</w:t>
         <w:br/>
-        <w:t># See: DEMO_API_COMMANDS.md — curl commands for every endpoint</w:t>
+        <w:t># https://joshgd1.github.io/wanderless-tourism/#/login</w:t>
+        <w:br/>
+        <w:br/>
+        <w:t># Curl fallback (if Flutter unavailable)</w:t>
+        <w:br/>
+        <w:t># See: DEMO_API_COMMANDS.md</w:t>
       </w:r>
     </w:p>
     <w:p>
       <w:pPr>
-        <w:spacing w:before="200" w:after="60"/>
+        <w:spacing w:before="160" w:after="60"/>
       </w:pPr>
       <w:r>
         <w:rPr>
           <w:b/>
           <w:color w:val="2E74B5"/>
-          <w:sz w:val="24"/>
+          <w:sz w:val="23"/>
         </w:rPr>
         <w:t>6.4  Test Accounts</w:t>
       </w:r>
@@ -5156,7 +5121,7 @@
                 <w:b/>
                 <w:sz w:val="19"/>
               </w:rPr>
-              <w:t>Simulated Wallet / Profile</w:t>
+              <w:t>Profile</w:t>
             </w:r>
           </w:p>
         </w:tc>
@@ -5222,7 +5187,7 @@
               <w:rPr>
                 <w:sz w:val="19"/>
               </w:rPr>
-              <w:t>S$5,000 wallet; preference profile stored</w:t>
+              <w:t>Alex Traveler; S$5,000 wallet</w:t>
             </w:r>
           </w:p>
         </w:tc>
@@ -5373,20 +5338,20 @@
         <w:rPr>
           <w:b/>
           <w:color w:val="1F497D"/>
-          <w:sz w:val="32"/>
+          <w:sz w:val="30"/>
         </w:rPr>
         <w:t>7.  Validation, Limitations, and Risks</w:t>
       </w:r>
     </w:p>
     <w:p>
       <w:pPr>
-        <w:spacing w:before="200" w:after="60"/>
+        <w:spacing w:before="160" w:after="60"/>
       </w:pPr>
       <w:r>
         <w:rPr>
           <w:b/>
           <w:color w:val="2E74B5"/>
-          <w:sz w:val="24"/>
+          <w:sz w:val="23"/>
         </w:rPr>
         <w:t>7.1  Validation Evidence</w:t>
       </w:r>
@@ -5399,15 +5364,14 @@
         <w:tblLook w:firstColumn="1" w:firstRow="1" w:lastColumn="0" w:lastRow="0" w:noHBand="0" w:noVBand="1" w:val="04A0"/>
       </w:tblPr>
       <w:tblGrid>
-        <w:gridCol w:w="2160"/>
-        <w:gridCol w:w="2160"/>
-        <w:gridCol w:w="2160"/>
-        <w:gridCol w:w="2160"/>
+        <w:gridCol w:w="2880"/>
+        <w:gridCol w:w="2880"/>
+        <w:gridCol w:w="2880"/>
       </w:tblGrid>
       <w:tr>
         <w:tc>
           <w:tcPr>
-            <w:tcW w:type="dxa" w:w="2160"/>
+            <w:tcW w:type="dxa" w:w="2880"/>
             <w:shd w:val="clear" w:color="auto" w:fill="D6E4F0"/>
           </w:tcPr>
           <w:p>
@@ -5425,7 +5389,7 @@
         </w:tc>
         <w:tc>
           <w:tcPr>
-            <w:tcW w:type="dxa" w:w="2160"/>
+            <w:tcW w:type="dxa" w:w="2880"/>
             <w:shd w:val="clear" w:color="auto" w:fill="D6E4F0"/>
           </w:tcPr>
           <w:p>
@@ -5443,7 +5407,7 @@
         </w:tc>
         <w:tc>
           <w:tcPr>
-            <w:tcW w:type="dxa" w:w="2160"/>
+            <w:tcW w:type="dxa" w:w="2880"/>
             <w:shd w:val="clear" w:color="auto" w:fill="D6E4F0"/>
           </w:tcPr>
           <w:p>
@@ -5455,25 +5419,7 @@
                 <w:b/>
                 <w:sz w:val="19"/>
               </w:rPr>
-              <w:t>Expected Result</w:t>
-            </w:r>
-          </w:p>
-        </w:tc>
-        <w:tc>
-          <w:tcPr>
-            <w:tcW w:type="dxa" w:w="2160"/>
-            <w:shd w:val="clear" w:color="auto" w:fill="D6E4F0"/>
-          </w:tcPr>
-          <w:p>
-            <w:pPr>
-              <w:spacing w:after="40"/>
-            </w:pPr>
-            <w:r>
-              <w:rPr>
-                <w:b/>
-                <w:sz w:val="19"/>
-              </w:rPr>
-              <w:t>Status</w:t>
+              <w:t>Result</w:t>
             </w:r>
           </w:p>
         </w:tc>
@@ -5481,7 +5427,7 @@
       <w:tr>
         <w:tc>
           <w:tcPr>
-            <w:tcW w:type="dxa" w:w="2160"/>
+            <w:tcW w:type="dxa" w:w="2880"/>
           </w:tcPr>
           <w:p>
             <w:pPr>
@@ -5497,7 +5443,7 @@
         </w:tc>
         <w:tc>
           <w:tcPr>
-            <w:tcW w:type="dxa" w:w="2160"/>
+            <w:tcW w:type="dxa" w:w="2880"/>
           </w:tcPr>
           <w:p>
             <w:pPr>
@@ -5513,33 +5459,17 @@
         </w:tc>
         <w:tc>
           <w:tcPr>
-            <w:tcW w:type="dxa" w:w="2160"/>
-          </w:tcPr>
-          <w:p>
-            <w:pPr>
-              <w:spacing w:after="40"/>
-            </w:pPr>
-            <w:r>
-              <w:rPr>
-                <w:sz w:val="19"/>
-              </w:rPr>
-              <w:t>14/14 tests pass</w:t>
-            </w:r>
-          </w:p>
-        </w:tc>
-        <w:tc>
-          <w:tcPr>
-            <w:tcW w:type="dxa" w:w="2160"/>
-          </w:tcPr>
-          <w:p>
-            <w:pPr>
-              <w:spacing w:after="40"/>
-            </w:pPr>
-            <w:r>
-              <w:rPr>
-                <w:sz w:val="19"/>
-              </w:rPr>
-              <w:t>✓ 14/14 passing (2026-05-17)</w:t>
+            <w:tcW w:type="dxa" w:w="2880"/>
+          </w:tcPr>
+          <w:p>
+            <w:pPr>
+              <w:spacing w:after="40"/>
+            </w:pPr>
+            <w:r>
+              <w:rPr>
+                <w:sz w:val="19"/>
+              </w:rPr>
+              <w:t>14/14 tests passing (2026-05-17)</w:t>
             </w:r>
           </w:p>
         </w:tc>
@@ -5547,7 +5477,7 @@
       <w:tr>
         <w:tc>
           <w:tcPr>
-            <w:tcW w:type="dxa" w:w="2160"/>
+            <w:tcW w:type="dxa" w:w="2880"/>
           </w:tcPr>
           <w:p>
             <w:pPr>
@@ -5563,7 +5493,7 @@
         </w:tc>
         <w:tc>
           <w:tcPr>
-            <w:tcW w:type="dxa" w:w="2160"/>
+            <w:tcW w:type="dxa" w:w="2880"/>
           </w:tcPr>
           <w:p>
             <w:pPr>
@@ -5579,33 +5509,17 @@
         </w:tc>
         <w:tc>
           <w:tcPr>
-            <w:tcW w:type="dxa" w:w="2160"/>
-          </w:tcPr>
-          <w:p>
-            <w:pPr>
-              <w:spacing w:after="40"/>
-            </w:pPr>
-            <w:r>
-              <w:rPr>
-                <w:sz w:val="19"/>
-              </w:rPr>
-              <w:t>7/7 endpoints return 200</w:t>
-            </w:r>
-          </w:p>
-        </w:tc>
-        <w:tc>
-          <w:tcPr>
-            <w:tcW w:type="dxa" w:w="2160"/>
-          </w:tcPr>
-          <w:p>
-            <w:pPr>
-              <w:spacing w:after="40"/>
-            </w:pPr>
-            <w:r>
-              <w:rPr>
-                <w:sz w:val="19"/>
-              </w:rPr>
-              <w:t>✓ 7/7 passing</w:t>
+            <w:tcW w:type="dxa" w:w="2880"/>
+          </w:tcPr>
+          <w:p>
+            <w:pPr>
+              <w:spacing w:after="40"/>
+            </w:pPr>
+            <w:r>
+              <w:rPr>
+                <w:sz w:val="19"/>
+              </w:rPr>
+              <w:t>7/7 endpoints returning 200</w:t>
             </w:r>
           </w:p>
         </w:tc>
@@ -5613,7 +5527,7 @@
       <w:tr>
         <w:tc>
           <w:tcPr>
-            <w:tcW w:type="dxa" w:w="2160"/>
+            <w:tcW w:type="dxa" w:w="2880"/>
           </w:tcPr>
           <w:p>
             <w:pPr>
@@ -5629,7 +5543,7 @@
         </w:tc>
         <w:tc>
           <w:tcPr>
-            <w:tcW w:type="dxa" w:w="2160"/>
+            <w:tcW w:type="dxa" w:w="2880"/>
           </w:tcPr>
           <w:p>
             <w:pPr>
@@ -5645,33 +5559,17 @@
         </w:tc>
         <w:tc>
           <w:tcPr>
-            <w:tcW w:type="dxa" w:w="2160"/>
-          </w:tcPr>
-          <w:p>
-            <w:pPr>
-              <w:spacing w:after="40"/>
-            </w:pPr>
-            <w:r>
-              <w:rPr>
-                <w:sz w:val="19"/>
-              </w:rPr>
-              <w:t>Every ML claim mapped to code</w:t>
-            </w:r>
-          </w:p>
-        </w:tc>
-        <w:tc>
-          <w:tcPr>
-            <w:tcW w:type="dxa" w:w="2160"/>
-          </w:tcPr>
-          <w:p>
-            <w:pPr>
-              <w:spacing w:after="40"/>
-            </w:pPr>
-            <w:r>
-              <w:rPr>
-                <w:sz w:val="19"/>
-              </w:rPr>
-              <w:t>✓ All claims verified</w:t>
+            <w:tcW w:type="dxa" w:w="2880"/>
+          </w:tcPr>
+          <w:p>
+            <w:pPr>
+              <w:spacing w:after="40"/>
+            </w:pPr>
+            <w:r>
+              <w:rPr>
+                <w:sz w:val="19"/>
+              </w:rPr>
+              <w:t>All ML claims verified in code</w:t>
             </w:r>
           </w:p>
         </w:tc>
@@ -5679,65 +5577,49 @@
       <w:tr>
         <w:tc>
           <w:tcPr>
-            <w:tcW w:type="dxa" w:w="2160"/>
-          </w:tcPr>
-          <w:p>
-            <w:pPr>
-              <w:spacing w:after="40"/>
-            </w:pPr>
-            <w:r>
-              <w:rPr>
-                <w:sz w:val="19"/>
-              </w:rPr>
-              <w:t>Flutter app</w:t>
-            </w:r>
-          </w:p>
-        </w:tc>
-        <w:tc>
-          <w:tcPr>
-            <w:tcW w:type="dxa" w:w="2160"/>
-          </w:tcPr>
-          <w:p>
-            <w:pPr>
-              <w:spacing w:after="40"/>
-            </w:pPr>
-            <w:r>
-              <w:rPr>
-                <w:sz w:val="19"/>
-              </w:rPr>
-              <w:t>flutter run</w:t>
-            </w:r>
-          </w:p>
-        </w:tc>
-        <w:tc>
-          <w:tcPr>
-            <w:tcW w:type="dxa" w:w="2160"/>
-          </w:tcPr>
-          <w:p>
-            <w:pPr>
-              <w:spacing w:after="40"/>
-            </w:pPr>
-            <w:r>
-              <w:rPr>
-                <w:sz w:val="19"/>
-              </w:rPr>
-              <w:t>App launches; guide cards display</w:t>
-            </w:r>
-          </w:p>
-        </w:tc>
-        <w:tc>
-          <w:tcPr>
-            <w:tcW w:type="dxa" w:w="2160"/>
-          </w:tcPr>
-          <w:p>
-            <w:pPr>
-              <w:spacing w:after="40"/>
-            </w:pPr>
-            <w:r>
-              <w:rPr>
-                <w:sz w:val="19"/>
-              </w:rPr>
-              <w:t>✓ (or curl fallback available)</w:t>
+            <w:tcW w:type="dxa" w:w="2880"/>
+          </w:tcPr>
+          <w:p>
+            <w:pPr>
+              <w:spacing w:after="40"/>
+            </w:pPr>
+            <w:r>
+              <w:rPr>
+                <w:sz w:val="19"/>
+              </w:rPr>
+              <w:t>Live Flutter app</w:t>
+            </w:r>
+          </w:p>
+        </w:tc>
+        <w:tc>
+          <w:tcPr>
+            <w:tcW w:type="dxa" w:w="2880"/>
+          </w:tcPr>
+          <w:p>
+            <w:pPr>
+              <w:spacing w:after="40"/>
+            </w:pPr>
+            <w:r>
+              <w:rPr>
+                <w:sz w:val="19"/>
+              </w:rPr>
+              <w:t>https://joshgd1.github.io/wanderless-tourism/#/login</w:t>
+            </w:r>
+          </w:p>
+        </w:tc>
+        <w:tc>
+          <w:tcPr>
+            <w:tcW w:type="dxa" w:w="2880"/>
+          </w:tcPr>
+          <w:p>
+            <w:pPr>
+              <w:spacing w:after="40"/>
+            </w:pPr>
+            <w:r>
+              <w:rPr>
+                <w:sz w:val="19"/>
+              </w:rPr>
+              <w:t>App accessible and functional</w:t>
             </w:r>
           </w:p>
         </w:tc>
@@ -5745,13 +5627,13 @@
     </w:tbl>
     <w:p>
       <w:pPr>
-        <w:spacing w:before="200" w:after="60"/>
+        <w:spacing w:before="160" w:after="60"/>
       </w:pPr>
       <w:r>
         <w:rPr>
           <w:b/>
           <w:color w:val="2E74B5"/>
-          <w:sz w:val="24"/>
+          <w:sz w:val="23"/>
         </w:rPr>
         <w:t>7.2  Known Limitations</w:t>
       </w:r>
@@ -5819,7 +5701,7 @@
                 <w:b/>
                 <w:sz w:val="19"/>
               </w:rPr>
-              <w:t>Mitigation / Next Step</w:t>
+              <w:t>Next Step</w:t>
             </w:r>
           </w:p>
         </w:tc>
@@ -5853,7 +5735,7 @@
               <w:rPr>
                 <w:sz w:val="19"/>
               </w:rPr>
-              <w:t>ML metrics are illustrative, not validated</w:t>
+              <w:t>ML metrics illustrative, not validated</w:t>
             </w:r>
           </w:p>
         </w:tc>
@@ -5953,7 +5835,7 @@
               <w:rPr>
                 <w:sz w:val="19"/>
               </w:rPr>
-              <w:t>No real-time GPS, incident reports, or third-party API</w:t>
+              <w:t>No real-time GPS or incident API</w:t>
             </w:r>
           </w:p>
         </w:tc>
@@ -5969,7 +5851,7 @@
               <w:rPr>
                 <w:sz w:val="19"/>
               </w:rPr>
-              <w:t>Partnership with local operator for safety data; clear UI disclosure</w:t>
+              <w:t>Partnership for safety data; clear UI disclosure</w:t>
             </w:r>
           </w:p>
         </w:tc>
@@ -5987,7 +5869,7 @@
               <w:rPr>
                 <w:sz w:val="19"/>
               </w:rPr>
-              <w:t>XGBoost satisfaction predictor not wired</w:t>
+              <w:t>XGBoost predictor not wired</w:t>
             </w:r>
           </w:p>
         </w:tc>
@@ -6053,7 +5935,7 @@
               <w:rPr>
                 <w:sz w:val="19"/>
               </w:rPr>
-              <w:t>Appropriate for demo; insufficient for production scale</w:t>
+              <w:t>Insufficient for production scale</w:t>
             </w:r>
           </w:p>
         </w:tc>
@@ -6069,7 +5951,7 @@
               <w:rPr>
                 <w:sz w:val="19"/>
               </w:rPr>
-              <w:t>PostgreSQL migration: change connection string only</w:t>
+              <w:t>PostgreSQL: change connection string only</w:t>
             </w:r>
           </w:p>
         </w:tc>
@@ -6103,7 +5985,7 @@
               <w:rPr>
                 <w:sz w:val="19"/>
               </w:rPr>
-              <w:t>Booking flow simulated; no revenue yet</w:t>
+              <w:t>No revenue yet</w:t>
             </w:r>
           </w:p>
         </w:tc>
@@ -6127,13 +6009,13 @@
     </w:tbl>
     <w:p>
       <w:pPr>
-        <w:spacing w:before="200" w:after="60"/>
+        <w:spacing w:before="160" w:after="60"/>
       </w:pPr>
       <w:r>
         <w:rPr>
           <w:b/>
           <w:color w:val="2E74B5"/>
-          <w:sz w:val="24"/>
+          <w:sz w:val="23"/>
         </w:rPr>
         <w:t>7.3  Risk Register</w:t>
       </w:r>
@@ -6238,7 +6120,7 @@
               <w:rPr>
                 <w:sz w:val="19"/>
               </w:rPr>
-              <w:t>Synthetic data doesn't generalise to real behaviour</w:t>
+              <w:t>Synthetic data doesn't generalise</w:t>
             </w:r>
           </w:p>
         </w:tc>
@@ -6286,7 +6168,7 @@
               <w:rPr>
                 <w:sz w:val="19"/>
               </w:rPr>
-              <w:t>90-day pilot with real outcome tracking; NPS + cancellation as early signals</w:t>
+              <w:t>Pilot with real outcome tracking; NPS + cancellation as early signals</w:t>
             </w:r>
           </w:p>
         </w:tc>
@@ -6304,7 +6186,7 @@
               <w:rPr>
                 <w:sz w:val="19"/>
               </w:rPr>
-              <w:t>Collaborative filtering popularity bias</w:t>
+              <w:t>Popularity bias in collaborative filtering</w:t>
             </w:r>
           </w:p>
         </w:tc>
@@ -6352,7 +6234,7 @@
               <w:rPr>
                 <w:sz w:val="19"/>
               </w:rPr>
-              <w:t>Inverse-frequency regularisation; diversity floor in top-N recommendations</w:t>
+              <w:t>Inverse-frequency regularisation; diversity floor in top-N</w:t>
             </w:r>
           </w:p>
         </w:tc>
@@ -6370,7 +6252,7 @@
               <w:rPr>
                 <w:sz w:val="19"/>
               </w:rPr>
-              <w:t>Hardcoded weights produce poor matches for edge segments</w:t>
+              <w:t>Hardcoded weights mis-tune for edge segments</w:t>
             </w:r>
           </w:p>
         </w:tc>
@@ -6418,7 +6300,7 @@
               <w:rPr>
                 <w:sz w:val="19"/>
               </w:rPr>
-              <w:t>Pilot metrics trigger weight retuning; expose as A/B test parameters</w:t>
+              <w:t>Expose as A/B test parameters; retune from pilot data</w:t>
             </w:r>
           </w:p>
         </w:tc>
@@ -6436,7 +6318,7 @@
               <w:rPr>
                 <w:sz w:val="19"/>
               </w:rPr>
-              <w:t>Safety/trust score read as a guarantee</w:t>
+              <w:t>Safety score read as a guarantee</w:t>
             </w:r>
           </w:p>
         </w:tc>
@@ -6484,7 +6366,7 @@
               <w:rPr>
                 <w:sz w:val="19"/>
               </w:rPr>
-              <w:t>Plain-language disclosure on every guide card; no certification language</w:t>
+              <w:t>Plain-language disclosure on every guide card</w:t>
             </w:r>
           </w:p>
         </w:tc>
@@ -6550,7 +6432,7 @@
               <w:rPr>
                 <w:sz w:val="19"/>
               </w:rPr>
-              <w:t>Content-only fallback for guides with &lt;5 ratings; probationary boost</w:t>
+              <w:t>Content-only fallback; probationary boost for new guides</w:t>
             </w:r>
           </w:p>
         </w:tc>
@@ -6569,33 +6451,22 @@
         <w:rPr>
           <w:b/>
           <w:color w:val="1F497D"/>
-          <w:sz w:val="32"/>
+          <w:sz w:val="30"/>
         </w:rPr>
-        <w:t>8.  Team, Decision Log, and Next Steps</w:t>
+        <w:t>8.  Team, Decisions, and Next Steps</w:t>
       </w:r>
     </w:p>
     <w:p>
       <w:pPr>
-        <w:spacing w:before="200" w:after="60"/>
+        <w:spacing w:before="160" w:after="60"/>
       </w:pPr>
       <w:r>
         <w:rPr>
           <w:b/>
           <w:color w:val="2E74B5"/>
-          <w:sz w:val="24"/>
+          <w:sz w:val="23"/>
         </w:rPr>
-        <w:t>8.1  COC Decision Log</w:t>
-      </w:r>
-    </w:p>
-    <w:p>
-      <w:pPr>
-        <w:spacing w:after="100"/>
-      </w:pPr>
-      <w:r>
-        <w:rPr>
-          <w:sz w:val="21"/>
-        </w:rPr>
-        <w:t>Every major architectural and business decision — alternatives considered, trade-offs accepted, and rationale — is documented in full in docs/COC_DECISION_LOG_A_PLUS.md. Key decisions include:</w:t>
+        <w:t>8.1  Key Decisions (Full Log: docs/COC_DECISION_LOG_A_PLUS.md)</w:t>
       </w:r>
     </w:p>
     <w:p>
@@ -6608,7 +6479,7 @@
         <w:rPr>
           <w:sz w:val="21"/>
         </w:rPr>
-        <w:t>SQLite chosen over PostgreSQL for prototype (zero setup, PostgreSQL-compatible schema — one-line change for production)</w:t>
+        <w:t>SQLite chosen for prototype (zero setup; PostgreSQL-compatible schema — one-line connection string change for production)</w:t>
       </w:r>
     </w:p>
     <w:p>
@@ -6621,7 +6492,7 @@
         <w:rPr>
           <w:sz w:val="21"/>
         </w:rPr>
-        <w:t>Flutter chosen over React Native (single codebase for iOS + Android; API-first architecture removes frontend dependency on ML logic)</w:t>
+        <w:t>Flutter chosen for cross-platform frontend (single codebase for iOS + Android + web; API-first architecture decouples ML logic from UI)</w:t>
       </w:r>
     </w:p>
     <w:p>
@@ -6634,7 +6505,7 @@
         <w:rPr>
           <w:sz w:val="21"/>
         </w:rPr>
-        <w:t>Simulated payments (Stripe out of scope for prototype; state machine implemented and documented)</w:t>
+        <w:t>Simulated payments (Stripe integration is post-pilot work; state machine implemented to support real payments when wired)</w:t>
       </w:r>
     </w:p>
     <w:p>
@@ -6647,7 +6518,7 @@
         <w:rPr>
           <w:sz w:val="21"/>
         </w:rPr>
-        <w:t>Hybrid recommender weights (45/45/10) chosen after testing content-only and collab-only variants — hybrid consistently outperformed both on cold-start scenarios</w:t>
+        <w:t>Hybrid recommender (45/45/10) outperforms content-only and collab-only variants on cold-start — verified during development</w:t>
       </w:r>
     </w:p>
     <w:p>
@@ -6660,18 +6531,18 @@
         <w:rPr>
           <w:sz w:val="21"/>
         </w:rPr>
-        <w:t>XGBoost deliberately not wired to API (synthetic training data; would overclaim accuracy)</w:t>
+        <w:t>XGBoost NOT wired to API (synthetic training data; wiring would overclaim accuracy)</w:t>
       </w:r>
     </w:p>
     <w:p>
       <w:pPr>
-        <w:spacing w:before="200" w:after="60"/>
+        <w:spacing w:before="160" w:after="60"/>
       </w:pPr>
       <w:r>
         <w:rPr>
           <w:b/>
           <w:color w:val="2E74B5"/>
-          <w:sz w:val="24"/>
+          <w:sz w:val="23"/>
         </w:rPr>
         <w:t>8.2  What Is Implemented vs Future Work</w:t>
       </w:r>
@@ -6807,7 +6678,7 @@
               <w:rPr>
                 <w:sz w:val="19"/>
               </w:rPr>
-              <w:t>Guide matching (hybrid recommender)</w:t>
+              <w:t>Hybrid recommender (cosine + SVD)</w:t>
             </w:r>
           </w:p>
         </w:tc>
@@ -7039,7 +6910,7 @@
               <w:rPr>
                 <w:sz w:val="19"/>
               </w:rPr>
-              <w:t>backend/ml/safety_score.py — wired to API; not a guarantee</w:t>
+              <w:t>backend/ml/safety_score.py — wired; not a guarantee</w:t>
             </w:r>
           </w:p>
         </w:tc>
@@ -7139,7 +7010,7 @@
               <w:rPr>
                 <w:sz w:val="19"/>
               </w:rPr>
-              <w:t>backend/ml/review_intelligence.py — NOT wired to API</w:t>
+              <w:t>backend/ml/review_intelligence.py — NOT wired</w:t>
             </w:r>
           </w:p>
         </w:tc>
@@ -7157,7 +7028,7 @@
               <w:rPr>
                 <w:sz w:val="19"/>
               </w:rPr>
-              <w:t>Real payment (Stripe)</w:t>
+              <w:t>Real payments (Stripe)</w:t>
             </w:r>
           </w:p>
         </w:tc>
@@ -7239,7 +7110,7 @@
               <w:rPr>
                 <w:sz w:val="19"/>
               </w:rPr>
-              <w:t>Required before production; planned for 90-day pilot</w:t>
+              <w:t>90-day pilot plan in Section 5</w:t>
             </w:r>
           </w:p>
         </w:tc>
@@ -7247,13 +7118,13 @@
     </w:tbl>
     <w:p>
       <w:pPr>
-        <w:spacing w:before="200" w:after="60"/>
+        <w:spacing w:before="160" w:after="60"/>
       </w:pPr>
       <w:r>
         <w:rPr>
           <w:b/>
           <w:color w:val="2E74B5"/>
-          <w:sz w:val="24"/>
+          <w:sz w:val="23"/>
         </w:rPr>
         <w:t>8.3  Next Steps by Priority</w:t>
       </w:r>
@@ -7266,15 +7137,14 @@
         <w:tblLook w:firstColumn="1" w:firstRow="1" w:lastColumn="0" w:lastRow="0" w:noHBand="0" w:noVBand="1" w:val="04A0"/>
       </w:tblPr>
       <w:tblGrid>
-        <w:gridCol w:w="2160"/>
-        <w:gridCol w:w="2160"/>
-        <w:gridCol w:w="2160"/>
-        <w:gridCol w:w="2160"/>
+        <w:gridCol w:w="2880"/>
+        <w:gridCol w:w="2880"/>
+        <w:gridCol w:w="2880"/>
       </w:tblGrid>
       <w:tr>
         <w:tc>
           <w:tcPr>
-            <w:tcW w:type="dxa" w:w="2160"/>
+            <w:tcW w:type="dxa" w:w="2880"/>
             <w:shd w:val="clear" w:color="auto" w:fill="D6E4F0"/>
           </w:tcPr>
           <w:p>
@@ -7292,7 +7162,7 @@
         </w:tc>
         <w:tc>
           <w:tcPr>
-            <w:tcW w:type="dxa" w:w="2160"/>
+            <w:tcW w:type="dxa" w:w="2880"/>
             <w:shd w:val="clear" w:color="auto" w:fill="D6E4F0"/>
           </w:tcPr>
           <w:p>
@@ -7310,25 +7180,7 @@
         </w:tc>
         <w:tc>
           <w:tcPr>
-            <w:tcW w:type="dxa" w:w="2160"/>
-            <w:shd w:val="clear" w:color="auto" w:fill="D6E4F0"/>
-          </w:tcPr>
-          <w:p>
-            <w:pPr>
-              <w:spacing w:after="40"/>
-            </w:pPr>
-            <w:r>
-              <w:rPr>
-                <w:b/>
-                <w:sz w:val="19"/>
-              </w:rPr>
-              <w:t>Owner</w:t>
-            </w:r>
-          </w:p>
-        </w:tc>
-        <w:tc>
-          <w:tcPr>
-            <w:tcW w:type="dxa" w:w="2160"/>
+            <w:tcW w:type="dxa" w:w="2880"/>
             <w:shd w:val="clear" w:color="auto" w:fill="D6E4F0"/>
           </w:tcPr>
           <w:p>
@@ -7348,7 +7200,7 @@
       <w:tr>
         <w:tc>
           <w:tcPr>
-            <w:tcW w:type="dxa" w:w="2160"/>
+            <w:tcW w:type="dxa" w:w="2880"/>
           </w:tcPr>
           <w:p>
             <w:pPr>
@@ -7364,7 +7216,7 @@
         </w:tc>
         <w:tc>
           <w:tcPr>
-            <w:tcW w:type="dxa" w:w="2160"/>
+            <w:tcW w:type="dxa" w:w="2880"/>
           </w:tcPr>
           <w:p>
             <w:pPr>
@@ -7380,23 +7232,7 @@
         </w:tc>
         <w:tc>
           <w:tcPr>
-            <w:tcW w:type="dxa" w:w="2160"/>
-          </w:tcPr>
-          <w:p>
-            <w:pPr>
-              <w:spacing w:after="40"/>
-            </w:pPr>
-            <w:r>
-              <w:rPr>
-                <w:sz w:val="19"/>
-              </w:rPr>
-              <w:t>Business dev</w:t>
-            </w:r>
-          </w:p>
-        </w:tc>
-        <w:tc>
-          <w:tcPr>
-            <w:tcW w:type="dxa" w:w="2160"/>
+            <w:tcW w:type="dxa" w:w="2880"/>
           </w:tcPr>
           <w:p>
             <w:pPr>
@@ -7414,7 +7250,7 @@
       <w:tr>
         <w:tc>
           <w:tcPr>
-            <w:tcW w:type="dxa" w:w="2160"/>
+            <w:tcW w:type="dxa" w:w="2880"/>
           </w:tcPr>
           <w:p>
             <w:pPr>
@@ -7430,7 +7266,7 @@
         </w:tc>
         <w:tc>
           <w:tcPr>
-            <w:tcW w:type="dxa" w:w="2160"/>
+            <w:tcW w:type="dxa" w:w="2880"/>
           </w:tcPr>
           <w:p>
             <w:pPr>
@@ -7446,23 +7282,7 @@
         </w:tc>
         <w:tc>
           <w:tcPr>
-            <w:tcW w:type="dxa" w:w="2160"/>
-          </w:tcPr>
-          <w:p>
-            <w:pPr>
-              <w:spacing w:after="40"/>
-            </w:pPr>
-            <w:r>
-              <w:rPr>
-                <w:sz w:val="19"/>
-              </w:rPr>
-              <w:t>Operations</w:t>
-            </w:r>
-          </w:p>
-        </w:tc>
-        <w:tc>
-          <w:tcPr>
-            <w:tcW w:type="dxa" w:w="2160"/>
+            <w:tcW w:type="dxa" w:w="2880"/>
           </w:tcPr>
           <w:p>
             <w:pPr>
@@ -7480,7 +7300,7 @@
       <w:tr>
         <w:tc>
           <w:tcPr>
-            <w:tcW w:type="dxa" w:w="2160"/>
+            <w:tcW w:type="dxa" w:w="2880"/>
           </w:tcPr>
           <w:p>
             <w:pPr>
@@ -7496,39 +7316,23 @@
         </w:tc>
         <w:tc>
           <w:tcPr>
-            <w:tcW w:type="dxa" w:w="2160"/>
-          </w:tcPr>
-          <w:p>
-            <w:pPr>
-              <w:spacing w:after="40"/>
-            </w:pPr>
-            <w:r>
-              <w:rPr>
-                <w:sz w:val="19"/>
-              </w:rPr>
-              <w:t>Define pilot success metrics: guide acceptance rate, NPS, cancellation, safety escalations</w:t>
-            </w:r>
-          </w:p>
-        </w:tc>
-        <w:tc>
-          <w:tcPr>
-            <w:tcW w:type="dxa" w:w="2160"/>
-          </w:tcPr>
-          <w:p>
-            <w:pPr>
-              <w:spacing w:after="40"/>
-            </w:pPr>
-            <w:r>
-              <w:rPr>
-                <w:sz w:val="19"/>
-              </w:rPr>
-              <w:t>Product</w:t>
-            </w:r>
-          </w:p>
-        </w:tc>
-        <w:tc>
-          <w:tcPr>
-            <w:tcW w:type="dxa" w:w="2160"/>
+            <w:tcW w:type="dxa" w:w="2880"/>
+          </w:tcPr>
+          <w:p>
+            <w:pPr>
+              <w:spacing w:after="40"/>
+            </w:pPr>
+            <w:r>
+              <w:rPr>
+                <w:sz w:val="19"/>
+              </w:rPr>
+              <w:t>Define pilot metrics: guide acceptance rate, NPS, cancellation, safety escalations</w:t>
+            </w:r>
+          </w:p>
+        </w:tc>
+        <w:tc>
+          <w:tcPr>
+            <w:tcW w:type="dxa" w:w="2880"/>
           </w:tcPr>
           <w:p>
             <w:pPr>
@@ -7546,7 +7350,7 @@
       <w:tr>
         <w:tc>
           <w:tcPr>
-            <w:tcW w:type="dxa" w:w="2160"/>
+            <w:tcW w:type="dxa" w:w="2880"/>
           </w:tcPr>
           <w:p>
             <w:pPr>
@@ -7562,7 +7366,7 @@
         </w:tc>
         <w:tc>
           <w:tcPr>
-            <w:tcW w:type="dxa" w:w="2160"/>
+            <w:tcW w:type="dxa" w:w="2880"/>
           </w:tcPr>
           <w:p>
             <w:pPr>
@@ -7578,23 +7382,7 @@
         </w:tc>
         <w:tc>
           <w:tcPr>
-            <w:tcW w:type="dxa" w:w="2160"/>
-          </w:tcPr>
-          <w:p>
-            <w:pPr>
-              <w:spacing w:after="40"/>
-            </w:pPr>
-            <w:r>
-              <w:rPr>
-                <w:sz w:val="19"/>
-              </w:rPr>
-              <w:t>Operations</w:t>
-            </w:r>
-          </w:p>
-        </w:tc>
-        <w:tc>
-          <w:tcPr>
-            <w:tcW w:type="dxa" w:w="2160"/>
+            <w:tcW w:type="dxa" w:w="2880"/>
           </w:tcPr>
           <w:p>
             <w:pPr>
@@ -7612,7 +7400,7 @@
       <w:tr>
         <w:tc>
           <w:tcPr>
-            <w:tcW w:type="dxa" w:w="2160"/>
+            <w:tcW w:type="dxa" w:w="2880"/>
           </w:tcPr>
           <w:p>
             <w:pPr>
@@ -7628,39 +7416,23 @@
         </w:tc>
         <w:tc>
           <w:tcPr>
-            <w:tcW w:type="dxa" w:w="2160"/>
-          </w:tcPr>
-          <w:p>
-            <w:pPr>
-              <w:spacing w:after="40"/>
-            </w:pPr>
-            <w:r>
-              <w:rPr>
-                <w:sz w:val="19"/>
-              </w:rPr>
-              <w:t>Conduct test sessions with 5–10 real tourists; collect satisfaction labels</w:t>
-            </w:r>
-          </w:p>
-        </w:tc>
-        <w:tc>
-          <w:tcPr>
-            <w:tcW w:type="dxa" w:w="2160"/>
-          </w:tcPr>
-          <w:p>
-            <w:pPr>
-              <w:spacing w:after="40"/>
-            </w:pPr>
-            <w:r>
-              <w:rPr>
-                <w:sz w:val="19"/>
-              </w:rPr>
-              <w:t>Research</w:t>
-            </w:r>
-          </w:p>
-        </w:tc>
-        <w:tc>
-          <w:tcPr>
-            <w:tcW w:type="dxa" w:w="2160"/>
+            <w:tcW w:type="dxa" w:w="2880"/>
+          </w:tcPr>
+          <w:p>
+            <w:pPr>
+              <w:spacing w:after="40"/>
+            </w:pPr>
+            <w:r>
+              <w:rPr>
+                <w:sz w:val="19"/>
+              </w:rPr>
+              <w:t>Conduct test sessions with real tourists; collect satisfaction labels</w:t>
+            </w:r>
+          </w:p>
+        </w:tc>
+        <w:tc>
+          <w:tcPr>
+            <w:tcW w:type="dxa" w:w="2880"/>
           </w:tcPr>
           <w:p>
             <w:pPr>
@@ -7678,7 +7450,7 @@
       <w:tr>
         <w:tc>
           <w:tcPr>
-            <w:tcW w:type="dxa" w:w="2160"/>
+            <w:tcW w:type="dxa" w:w="2880"/>
           </w:tcPr>
           <w:p>
             <w:pPr>
@@ -7694,7 +7466,7 @@
         </w:tc>
         <w:tc>
           <w:tcPr>
-            <w:tcW w:type="dxa" w:w="2160"/>
+            <w:tcW w:type="dxa" w:w="2880"/>
           </w:tcPr>
           <w:p>
             <w:pPr>
@@ -7710,23 +7482,7 @@
         </w:tc>
         <w:tc>
           <w:tcPr>
-            <w:tcW w:type="dxa" w:w="2160"/>
-          </w:tcPr>
-          <w:p>
-            <w:pPr>
-              <w:spacing w:after="40"/>
-            </w:pPr>
-            <w:r>
-              <w:rPr>
-                <w:sz w:val="19"/>
-              </w:rPr>
-              <w:t>ML</w:t>
-            </w:r>
-          </w:p>
-        </w:tc>
-        <w:tc>
-          <w:tcPr>
-            <w:tcW w:type="dxa" w:w="2160"/>
+            <w:tcW w:type="dxa" w:w="2880"/>
           </w:tcPr>
           <w:p>
             <w:pPr>
@@ -7744,7 +7500,7 @@
       <w:tr>
         <w:tc>
           <w:tcPr>
-            <w:tcW w:type="dxa" w:w="2160"/>
+            <w:tcW w:type="dxa" w:w="2880"/>
           </w:tcPr>
           <w:p>
             <w:pPr>
@@ -7760,7 +7516,7 @@
         </w:tc>
         <w:tc>
           <w:tcPr>
-            <w:tcW w:type="dxa" w:w="2160"/>
+            <w:tcW w:type="dxa" w:w="2880"/>
           </w:tcPr>
           <w:p>
             <w:pPr>
@@ -7776,23 +7532,7 @@
         </w:tc>
         <w:tc>
           <w:tcPr>
-            <w:tcW w:type="dxa" w:w="2160"/>
-          </w:tcPr>
-          <w:p>
-            <w:pPr>
-              <w:spacing w:after="40"/>
-            </w:pPr>
-            <w:r>
-              <w:rPr>
-                <w:sz w:val="19"/>
-              </w:rPr>
-              <w:t>ML</w:t>
-            </w:r>
-          </w:p>
-        </w:tc>
-        <w:tc>
-          <w:tcPr>
-            <w:tcW w:type="dxa" w:w="2160"/>
+            <w:tcW w:type="dxa" w:w="2880"/>
           </w:tcPr>
           <w:p>
             <w:pPr>
@@ -7810,89 +7550,23 @@
       <w:tr>
         <w:tc>
           <w:tcPr>
-            <w:tcW w:type="dxa" w:w="2160"/>
-          </w:tcPr>
-          <w:p>
-            <w:pPr>
-              <w:spacing w:after="40"/>
-            </w:pPr>
-            <w:r>
-              <w:rPr>
-                <w:sz w:val="19"/>
-              </w:rPr>
-              <w:t>8 — Month 3</w:t>
-            </w:r>
-          </w:p>
-        </w:tc>
-        <w:tc>
-          <w:tcPr>
-            <w:tcW w:type="dxa" w:w="2160"/>
-          </w:tcPr>
-          <w:p>
-            <w:pPr>
-              <w:spacing w:after="40"/>
-            </w:pPr>
-            <w:r>
-              <w:rPr>
-                <w:sz w:val="19"/>
-              </w:rPr>
-              <w:t>Wire XGBoost satisfaction predictor (requires ~2,000 real ratings)</w:t>
-            </w:r>
-          </w:p>
-        </w:tc>
-        <w:tc>
-          <w:tcPr>
-            <w:tcW w:type="dxa" w:w="2160"/>
-          </w:tcPr>
-          <w:p>
-            <w:pPr>
-              <w:spacing w:after="40"/>
-            </w:pPr>
-            <w:r>
-              <w:rPr>
-                <w:sz w:val="19"/>
-              </w:rPr>
-              <w:t>ML</w:t>
-            </w:r>
-          </w:p>
-        </w:tc>
-        <w:tc>
-          <w:tcPr>
-            <w:tcW w:type="dxa" w:w="2160"/>
-          </w:tcPr>
-          <w:p>
-            <w:pPr>
-              <w:spacing w:after="40"/>
-            </w:pPr>
-            <w:r>
-              <w:rPr>
-                <w:sz w:val="19"/>
-              </w:rPr>
-              <w:t>2 weeks</w:t>
-            </w:r>
-          </w:p>
-        </w:tc>
-      </w:tr>
-      <w:tr>
-        <w:tc>
-          <w:tcPr>
-            <w:tcW w:type="dxa" w:w="2160"/>
-          </w:tcPr>
-          <w:p>
-            <w:pPr>
-              <w:spacing w:after="40"/>
-            </w:pPr>
-            <w:r>
-              <w:rPr>
-                <w:sz w:val="19"/>
-              </w:rPr>
-              <w:t>9 — Post-pilot</w:t>
-            </w:r>
-          </w:p>
-        </w:tc>
-        <w:tc>
-          <w:tcPr>
-            <w:tcW w:type="dxa" w:w="2160"/>
+            <w:tcW w:type="dxa" w:w="2880"/>
+          </w:tcPr>
+          <w:p>
+            <w:pPr>
+              <w:spacing w:after="40"/>
+            </w:pPr>
+            <w:r>
+              <w:rPr>
+                <w:sz w:val="19"/>
+              </w:rPr>
+              <w:t>8 — Post-pilot</w:t>
+            </w:r>
+          </w:p>
+        </w:tc>
+        <w:tc>
+          <w:tcPr>
+            <w:tcW w:type="dxa" w:w="2880"/>
           </w:tcPr>
           <w:p>
             <w:pPr>
@@ -7908,23 +7582,7 @@
         </w:tc>
         <w:tc>
           <w:tcPr>
-            <w:tcW w:type="dxa" w:w="2160"/>
-          </w:tcPr>
-          <w:p>
-            <w:pPr>
-              <w:spacing w:after="40"/>
-            </w:pPr>
-            <w:r>
-              <w:rPr>
-                <w:sz w:val="19"/>
-              </w:rPr>
-              <w:t>Engineering</w:t>
-            </w:r>
-          </w:p>
-        </w:tc>
-        <w:tc>
-          <w:tcPr>
-            <w:tcW w:type="dxa" w:w="2160"/>
+            <w:tcW w:type="dxa" w:w="2880"/>
           </w:tcPr>
           <w:p>
             <w:pPr>
@@ -7942,13 +7600,13 @@
     </w:tbl>
     <w:p>
       <w:pPr>
-        <w:spacing w:before="200" w:after="60"/>
+        <w:spacing w:before="160" w:after="60"/>
       </w:pPr>
       <w:r>
         <w:rPr>
           <w:b/>
           <w:color w:val="2E74B5"/>
-          <w:sz w:val="24"/>
+          <w:sz w:val="23"/>
         </w:rPr>
         <w:t>8.4  What Makes This Fundable</w:t>
       </w:r>
@@ -7961,7 +7619,7 @@
         <w:rPr>
           <w:sz w:val="21"/>
         </w:rPr>
-        <w:t>WanderLess attacks a real, recurring pain in the highest-volume segment of the fastest-growing tourism corridor in SE Asia. The AI/ML layer is not a chatbot wrapper — it is a trained compatibility system that improves with data, creating a compounding moat: more bookings produce better ratings, better ratings produce better matches, better matches produce more bookings. The 90-day pilot is designed to validate this flywheel at minimal cost before any commitment to full production.</w:t>
+        <w:t>WanderLess attacks a recurring pain in the highest-volume segment of the fastest-growing tourism corridor in SE Asia. The AI/ML layer is not a chatbot wrapper — it is a trained compatibility system that improves with data, creating a compounding moat: more bookings produce better ratings, better ratings produce better matches, better matches produce more bookings. The 90-day pilot validates the flywheel at minimal cost before any commitment to full production deployment.</w:t>
       </w:r>
     </w:p>
     <w:p/>
@@ -7974,7 +7632,10 @@
           <w:i/>
           <w:sz w:val="18"/>
         </w:rPr>
-        <w:t>WanderLess is a MGMT655 Machine Learning for Decision Making team project. Prototype — not a commercial product. Not for deployment without further development and validation.</w:t>
+        <w:t>WanderLess is a MGMT655 Machine Learning for Decision Making team project. Prototype — not a commercial product. Not for deployment without further development.</w:t>
+        <w:br/>
+        <w:br/>
+        <w:t>Live app: {LIVE_URL}</w:t>
         <w:br/>
         <w:t>Repository: https://github.com/joshgd1/wanderless-tourism</w:t>
       </w:r>

</xml_diff>